<commit_message>
docs: sync report docx binary
</commit_message>
<xml_diff>
--- a/docs/MINI_PROJECT_2_REPORT.docx
+++ b/docs/MINI_PROJECT_2_REPORT.docx
@@ -5,13 +5,20 @@
     <w:p>
       <w:pPr>
         <w:spacing w:after="80"/>
+        <w:jc w:val="center"/>
+        <w:rPr>
+          <w:rFonts w:ascii="Times  New Roman" w:hAnsi="Times  New Roman"/>
+          <w:sz w:val="40"/>
+          <w:szCs w:val="40"/>
+        </w:rPr>
       </w:pPr>
       <w:r>
         <w:rPr>
-          <w:rFonts w:ascii="Calibri" w:hAnsi="Calibri"/>
+          <w:rFonts w:ascii="Times  New Roman" w:hAnsi="Times  New Roman"/>
           <w:b/>
           <w:color w:val="1E3A5F"/>
           <w:sz w:val="40"/>
+          <w:szCs w:val="40"/>
         </w:rPr>
         <w:t>MINI-PROJECT SHORT TECHNICAL REPORT</w:t>
       </w:r>
@@ -19,17 +26,28 @@
     <w:p>
       <w:pPr>
         <w:spacing w:after="40"/>
+        <w:rPr>
+          <w:rFonts w:ascii="Times  New Roman" w:hAnsi="Times  New Roman"/>
+          <w:sz w:val="28"/>
+          <w:szCs w:val="28"/>
+        </w:rPr>
       </w:pPr>
       <w:r>
         <w:rPr>
+          <w:rFonts w:ascii="Times  New Roman" w:hAnsi="Times  New Roman"/>
           <w:b/>
           <w:color w:val="1E3A5F"/>
+          <w:sz w:val="28"/>
+          <w:szCs w:val="28"/>
         </w:rPr>
         <w:t xml:space="preserve">Course: </w:t>
       </w:r>
       <w:r>
         <w:rPr>
+          <w:rFonts w:ascii="Times  New Roman" w:hAnsi="Times  New Roman"/>
           <w:color w:val="334155"/>
+          <w:sz w:val="28"/>
+          <w:szCs w:val="28"/>
         </w:rPr>
         <w:t>Cross-Platform Mobile App Development (VKU)</w:t>
       </w:r>
@@ -37,17 +55,28 @@
     <w:p>
       <w:pPr>
         <w:spacing w:after="40"/>
+        <w:rPr>
+          <w:rFonts w:ascii="Times  New Roman" w:hAnsi="Times  New Roman"/>
+          <w:sz w:val="28"/>
+          <w:szCs w:val="28"/>
+        </w:rPr>
       </w:pPr>
       <w:r>
         <w:rPr>
+          <w:rFonts w:ascii="Times  New Roman" w:hAnsi="Times  New Roman"/>
           <w:b/>
           <w:color w:val="1E3A5F"/>
+          <w:sz w:val="28"/>
+          <w:szCs w:val="28"/>
         </w:rPr>
         <w:t xml:space="preserve">Mini-Project Title: </w:t>
       </w:r>
       <w:r>
         <w:rPr>
+          <w:rFonts w:ascii="Times  New Roman" w:hAnsi="Times  New Roman"/>
           <w:color w:val="334155"/>
+          <w:sz w:val="28"/>
+          <w:szCs w:val="28"/>
         </w:rPr>
         <w:t>Mini-Project 2: Real-time Study Room Booking App (React Native &amp; Expo)</w:t>
       </w:r>
@@ -55,63 +84,92 @@
     <w:p>
       <w:pPr>
         <w:spacing w:after="40"/>
+        <w:rPr>
+          <w:rFonts w:ascii="Times  New Roman" w:hAnsi="Times  New Roman"/>
+          <w:sz w:val="28"/>
+          <w:szCs w:val="28"/>
+          <w:lang w:val="vi-VN"/>
+        </w:rPr>
       </w:pPr>
       <w:r>
         <w:rPr>
+          <w:rFonts w:ascii="Times  New Roman" w:hAnsi="Times  New Roman"/>
           <w:b/>
           <w:color w:val="1E3A5F"/>
+          <w:sz w:val="28"/>
+          <w:szCs w:val="28"/>
         </w:rPr>
         <w:t xml:space="preserve">Team / Student Name: </w:t>
       </w:r>
       <w:r>
         <w:rPr>
+          <w:rFonts w:ascii="Times  New Roman" w:hAnsi="Times  New Roman"/>
           <w:color w:val="334155"/>
+          <w:sz w:val="28"/>
+          <w:szCs w:val="28"/>
         </w:rPr>
         <w:t xml:space="preserve">Lê </w:t>
       </w:r>
       <w:r>
         <w:rPr>
+          <w:rFonts w:ascii="Times  New Roman" w:hAnsi="Times  New Roman"/>
           <w:color w:val="334155"/>
+          <w:sz w:val="28"/>
+          <w:szCs w:val="28"/>
         </w:rPr>
         <w:t>Cả</w:t>
       </w:r>
       <w:r>
         <w:rPr>
+          <w:rFonts w:ascii="Times  New Roman" w:hAnsi="Times  New Roman"/>
           <w:color w:val="334155"/>
+          <w:sz w:val="28"/>
+          <w:szCs w:val="28"/>
         </w:rPr>
-        <w:t>m (CAMLC25)</w:t>
+        <w:t>m</w:t>
       </w:r>
     </w:p>
     <w:p>
       <w:pPr>
         <w:spacing w:after="40"/>
+        <w:rPr>
+          <w:rFonts w:ascii="Times  New Roman" w:hAnsi="Times  New Roman"/>
+          <w:sz w:val="28"/>
+          <w:szCs w:val="28"/>
+          <w:lang w:val="vi-VN"/>
+        </w:rPr>
       </w:pPr>
       <w:r>
         <w:rPr>
+          <w:rFonts w:ascii="Times  New Roman" w:hAnsi="Times  New Roman"/>
           <w:b/>
           <w:color w:val="1E3A5F"/>
+          <w:sz w:val="28"/>
+          <w:szCs w:val="28"/>
         </w:rPr>
         <w:t xml:space="preserve">Submission Date: </w:t>
       </w:r>
       <w:r>
         <w:rPr>
+          <w:rFonts w:ascii="Times  New Roman" w:hAnsi="Times  New Roman"/>
           <w:color w:val="334155"/>
+          <w:sz w:val="28"/>
+          <w:szCs w:val="28"/>
         </w:rPr>
         <w:t>05/10/2026</w:t>
       </w:r>
     </w:p>
     <w:p>
       <w:pPr>
-        <w:spacing w:after="160"/>
-      </w:pPr>
-    </w:p>
-    <w:p>
-      <w:pPr>
         <w:pStyle w:val="u1"/>
         <w:spacing w:before="280" w:after="120"/>
+        <w:rPr>
+          <w:rFonts w:ascii="Times  New Roman" w:hAnsi="Times  New Roman"/>
+        </w:rPr>
       </w:pPr>
       <w:r>
         <w:rPr>
+          <w:rFonts w:ascii="Times  New Roman" w:hAnsi="Times  New Roman"/>
           <w:color w:val="1E3A5F"/>
         </w:rPr>
         <w:t>1. GENERAL INFORMATION &amp; DELIVERABLE LINKS</w:t>
@@ -121,29 +179,46 @@
       <w:pPr>
         <w:pStyle w:val="Duudong"/>
         <w:spacing w:after="60"/>
+        <w:rPr>
+          <w:rFonts w:ascii="Times  New Roman" w:hAnsi="Times  New Roman"/>
+          <w:sz w:val="28"/>
+          <w:szCs w:val="28"/>
+        </w:rPr>
       </w:pPr>
       <w:r>
         <w:rPr>
+          <w:rFonts w:ascii="Times  New Roman" w:hAnsi="Times  New Roman"/>
           <w:b/>
           <w:color w:val="1E3A5F"/>
+          <w:sz w:val="28"/>
+          <w:szCs w:val="28"/>
         </w:rPr>
         <w:t xml:space="preserve">Team Members: </w:t>
       </w:r>
       <w:r>
         <w:rPr>
+          <w:rFonts w:ascii="Times  New Roman" w:hAnsi="Times  New Roman"/>
           <w:color w:val="334155"/>
+          <w:sz w:val="28"/>
+          <w:szCs w:val="28"/>
         </w:rPr>
         <w:t xml:space="preserve">Lê </w:t>
       </w:r>
       <w:r>
         <w:rPr>
+          <w:rFonts w:ascii="Times  New Roman" w:hAnsi="Times  New Roman"/>
           <w:color w:val="334155"/>
+          <w:sz w:val="28"/>
+          <w:szCs w:val="28"/>
         </w:rPr>
         <w:t>Cả</w:t>
       </w:r>
       <w:r>
         <w:rPr>
+          <w:rFonts w:ascii="Times  New Roman" w:hAnsi="Times  New Roman"/>
           <w:color w:val="334155"/>
+          <w:sz w:val="28"/>
+          <w:szCs w:val="28"/>
         </w:rPr>
         <w:t>m — Student ID: 21IT001 — Role: Fullstack Mobile Architecture &amp; Concurrency Engine — Contribution: 100%</w:t>
       </w:r>
@@ -152,17 +227,38 @@
       <w:pPr>
         <w:pStyle w:val="Duudong"/>
         <w:spacing w:after="60"/>
+        <w:rPr>
+          <w:rFonts w:ascii="Times  New Roman" w:hAnsi="Times  New Roman"/>
+          <w:sz w:val="28"/>
+          <w:szCs w:val="28"/>
+        </w:rPr>
       </w:pPr>
       <w:r>
         <w:rPr>
+          <w:rFonts w:ascii="Segoe UI Emoji" w:hAnsi="Segoe UI Emoji" w:cs="Segoe UI Emoji"/>
           <w:b/>
           <w:color w:val="0284C7"/>
+          <w:sz w:val="28"/>
+          <w:szCs w:val="28"/>
         </w:rPr>
-        <w:t xml:space="preserve">🔗 Live Demo URL: </w:t>
+        <w:t>🔗</w:t>
       </w:r>
       <w:r>
         <w:rPr>
+          <w:rFonts w:ascii="Times  New Roman" w:hAnsi="Times  New Roman"/>
+          <w:b/>
+          <w:color w:val="0284C7"/>
+          <w:sz w:val="28"/>
+          <w:szCs w:val="28"/>
+        </w:rPr>
+        <w:t xml:space="preserve"> Live Demo URL: </w:t>
+      </w:r>
+      <w:r>
+        <w:rPr>
+          <w:rFonts w:ascii="Times  New Roman" w:hAnsi="Times  New Roman"/>
           <w:color w:val="334155"/>
+          <w:sz w:val="28"/>
+          <w:szCs w:val="28"/>
         </w:rPr>
         <w:t>https://camle-vku-study-room.lecam.workers.dev</w:t>
       </w:r>
@@ -171,17 +267,38 @@
       <w:pPr>
         <w:pStyle w:val="Duudong"/>
         <w:spacing w:after="60"/>
+        <w:rPr>
+          <w:rFonts w:ascii="Times  New Roman" w:hAnsi="Times  New Roman"/>
+          <w:sz w:val="28"/>
+          <w:szCs w:val="28"/>
+        </w:rPr>
       </w:pPr>
       <w:r>
         <w:rPr>
+          <w:rFonts w:ascii="Segoe UI Emoji" w:hAnsi="Segoe UI Emoji" w:cs="Segoe UI Emoji"/>
           <w:b/>
           <w:color w:val="0284C7"/>
+          <w:sz w:val="28"/>
+          <w:szCs w:val="28"/>
         </w:rPr>
-        <w:t xml:space="preserve">💻 GitHub Repository: </w:t>
+        <w:t>💻</w:t>
       </w:r>
       <w:r>
         <w:rPr>
+          <w:rFonts w:ascii="Times  New Roman" w:hAnsi="Times  New Roman"/>
+          <w:b/>
+          <w:color w:val="0284C7"/>
+          <w:sz w:val="28"/>
+          <w:szCs w:val="28"/>
+        </w:rPr>
+        <w:t xml:space="preserve"> GitHub Repository: </w:t>
+      </w:r>
+      <w:r>
+        <w:rPr>
+          <w:rFonts w:ascii="Times  New Roman" w:hAnsi="Times  New Roman"/>
           <w:color w:val="334155"/>
+          <w:sz w:val="28"/>
+          <w:szCs w:val="28"/>
         </w:rPr>
         <w:t>https://github.com/CAMLC25/camle-vku-study-room</w:t>
       </w:r>
@@ -190,17 +307,38 @@
       <w:pPr>
         <w:pStyle w:val="Duudong"/>
         <w:spacing w:after="60"/>
+        <w:rPr>
+          <w:rFonts w:ascii="Times  New Roman" w:hAnsi="Times  New Roman"/>
+          <w:sz w:val="28"/>
+          <w:szCs w:val="28"/>
+        </w:rPr>
       </w:pPr>
       <w:r>
         <w:rPr>
+          <w:rFonts w:ascii="Segoe UI Emoji" w:hAnsi="Segoe UI Emoji" w:cs="Segoe UI Emoji"/>
           <w:b/>
           <w:color w:val="1E3A5F"/>
+          <w:sz w:val="28"/>
+          <w:szCs w:val="28"/>
         </w:rPr>
-        <w:t xml:space="preserve">🎥 Video Demo (Optional): </w:t>
+        <w:t>🎥</w:t>
       </w:r>
       <w:r>
         <w:rPr>
+          <w:rFonts w:ascii="Times  New Roman" w:hAnsi="Times  New Roman"/>
+          <w:b/>
+          <w:color w:val="1E3A5F"/>
+          <w:sz w:val="28"/>
+          <w:szCs w:val="28"/>
+        </w:rPr>
+        <w:t xml:space="preserve"> Video Demo (Optional): </w:t>
+      </w:r>
+      <w:r>
+        <w:rPr>
+          <w:rFonts w:ascii="Times  New Roman" w:hAnsi="Times  New Roman"/>
           <w:color w:val="334155"/>
+          <w:sz w:val="28"/>
+          <w:szCs w:val="28"/>
         </w:rPr>
         <w:t>https://camle-vku-study-room.lecam.workers.dev</w:t>
       </w:r>
@@ -209,9 +347,13 @@
       <w:pPr>
         <w:pStyle w:val="u1"/>
         <w:spacing w:before="280" w:after="120"/>
+        <w:rPr>
+          <w:rFonts w:ascii="Times  New Roman" w:hAnsi="Times  New Roman"/>
+        </w:rPr>
       </w:pPr>
       <w:r>
         <w:rPr>
+          <w:rFonts w:ascii="Times  New Roman" w:hAnsi="Times  New Roman"/>
           <w:color w:val="1E3A5F"/>
         </w:rPr>
         <w:t>2. FEATURE IMPLEMENTATION CHECKLIST</w:t>
@@ -248,12 +390,19 @@
           <w:p>
             <w:pPr>
               <w:jc w:val="center"/>
+              <w:rPr>
+                <w:rFonts w:ascii="Times  New Roman" w:hAnsi="Times  New Roman"/>
+                <w:sz w:val="28"/>
+                <w:szCs w:val="28"/>
+              </w:rPr>
             </w:pPr>
             <w:r>
               <w:rPr>
+                <w:rFonts w:ascii="Times  New Roman" w:hAnsi="Times  New Roman"/>
                 <w:b/>
                 <w:color w:val="FFFFFF"/>
-                <w:sz w:val="19"/>
+                <w:sz w:val="28"/>
+                <w:szCs w:val="28"/>
               </w:rPr>
               <w:t>#</w:t>
             </w:r>
@@ -271,11 +420,20 @@
             </w:tcMar>
           </w:tcPr>
           <w:p>
+            <w:pPr>
+              <w:rPr>
+                <w:rFonts w:ascii="Times  New Roman" w:hAnsi="Times  New Roman"/>
+                <w:sz w:val="28"/>
+                <w:szCs w:val="28"/>
+              </w:rPr>
+            </w:pPr>
             <w:r>
               <w:rPr>
+                <w:rFonts w:ascii="Times  New Roman" w:hAnsi="Times  New Roman"/>
                 <w:b/>
                 <w:color w:val="FFFFFF"/>
-                <w:sz w:val="19"/>
+                <w:sz w:val="28"/>
+                <w:szCs w:val="28"/>
               </w:rPr>
               <w:t>Required Feature</w:t>
             </w:r>
@@ -295,12 +453,19 @@
           <w:p>
             <w:pPr>
               <w:jc w:val="center"/>
+              <w:rPr>
+                <w:rFonts w:ascii="Times  New Roman" w:hAnsi="Times  New Roman"/>
+                <w:sz w:val="28"/>
+                <w:szCs w:val="28"/>
+              </w:rPr>
             </w:pPr>
             <w:r>
               <w:rPr>
+                <w:rFonts w:ascii="Times  New Roman" w:hAnsi="Times  New Roman"/>
                 <w:b/>
                 <w:color w:val="FFFFFF"/>
-                <w:sz w:val="19"/>
+                <w:sz w:val="28"/>
+                <w:szCs w:val="28"/>
               </w:rPr>
               <w:t>Status</w:t>
             </w:r>
@@ -318,11 +483,20 @@
             </w:tcMar>
           </w:tcPr>
           <w:p>
+            <w:pPr>
+              <w:rPr>
+                <w:rFonts w:ascii="Times  New Roman" w:hAnsi="Times  New Roman"/>
+                <w:sz w:val="28"/>
+                <w:szCs w:val="28"/>
+              </w:rPr>
+            </w:pPr>
             <w:r>
               <w:rPr>
+                <w:rFonts w:ascii="Times  New Roman" w:hAnsi="Times  New Roman"/>
                 <w:b/>
                 <w:color w:val="FFFFFF"/>
-                <w:sz w:val="19"/>
+                <w:sz w:val="28"/>
+                <w:szCs w:val="28"/>
               </w:rPr>
               <w:t>Implementation Details &amp; Acceptance Level</w:t>
             </w:r>
@@ -347,11 +521,18 @@
           <w:p>
             <w:pPr>
               <w:jc w:val="center"/>
+              <w:rPr>
+                <w:rFonts w:ascii="Times  New Roman" w:hAnsi="Times  New Roman"/>
+                <w:sz w:val="28"/>
+                <w:szCs w:val="28"/>
+              </w:rPr>
             </w:pPr>
             <w:r>
               <w:rPr>
+                <w:rFonts w:ascii="Times  New Roman" w:hAnsi="Times  New Roman"/>
                 <w:color w:val="334155"/>
-                <w:sz w:val="18"/>
+                <w:sz w:val="28"/>
+                <w:szCs w:val="28"/>
               </w:rPr>
               <w:t>1</w:t>
             </w:r>
@@ -369,11 +550,20 @@
             </w:tcMar>
           </w:tcPr>
           <w:p>
+            <w:pPr>
+              <w:rPr>
+                <w:rFonts w:ascii="Times  New Roman" w:hAnsi="Times  New Roman"/>
+                <w:sz w:val="28"/>
+                <w:szCs w:val="28"/>
+              </w:rPr>
+            </w:pPr>
             <w:r>
               <w:rPr>
+                <w:rFonts w:ascii="Times  New Roman" w:hAnsi="Times  New Roman"/>
                 <w:b/>
                 <w:color w:val="1E3A5F"/>
-                <w:sz w:val="18"/>
+                <w:sz w:val="28"/>
+                <w:szCs w:val="28"/>
               </w:rPr>
               <w:t>Responsive Viewport &amp; Safe Area</w:t>
             </w:r>
@@ -393,14 +583,31 @@
           <w:p>
             <w:pPr>
               <w:jc w:val="center"/>
+              <w:rPr>
+                <w:rFonts w:ascii="Times  New Roman" w:hAnsi="Times  New Roman"/>
+                <w:sz w:val="28"/>
+                <w:szCs w:val="28"/>
+              </w:rPr>
             </w:pPr>
             <w:r>
               <w:rPr>
+                <w:rFonts w:ascii="Segoe UI Emoji" w:hAnsi="Segoe UI Emoji" w:cs="Segoe UI Emoji"/>
                 <w:b/>
                 <w:color w:val="10B981"/>
-                <w:sz w:val="18"/>
+                <w:sz w:val="28"/>
+                <w:szCs w:val="28"/>
               </w:rPr>
-              <w:t>✅ Complete</w:t>
+              <w:t>✅</w:t>
+            </w:r>
+            <w:r>
+              <w:rPr>
+                <w:rFonts w:ascii="Times  New Roman" w:hAnsi="Times  New Roman"/>
+                <w:b/>
+                <w:color w:val="10B981"/>
+                <w:sz w:val="28"/>
+                <w:szCs w:val="28"/>
+              </w:rPr>
+              <w:t xml:space="preserve"> Complete</w:t>
             </w:r>
           </w:p>
         </w:tc>
@@ -416,10 +623,19 @@
             </w:tcMar>
           </w:tcPr>
           <w:p>
+            <w:pPr>
+              <w:rPr>
+                <w:rFonts w:ascii="Times  New Roman" w:hAnsi="Times  New Roman"/>
+                <w:sz w:val="28"/>
+                <w:szCs w:val="28"/>
+              </w:rPr>
+            </w:pPr>
             <w:r>
               <w:rPr>
+                <w:rFonts w:ascii="Times  New Roman" w:hAnsi="Times  New Roman"/>
                 <w:color w:val="334155"/>
-                <w:sz w:val="18"/>
+                <w:sz w:val="28"/>
+                <w:szCs w:val="28"/>
               </w:rPr>
               <w:t>Custom hook useResponsiveLayout adapts across Mobile (1 col), Tablet (2 cols), Desktop (3 cols). Native safe area insets via react-native-safe-area-context.</w:t>
             </w:r>
@@ -444,11 +660,18 @@
           <w:p>
             <w:pPr>
               <w:jc w:val="center"/>
+              <w:rPr>
+                <w:rFonts w:ascii="Times  New Roman" w:hAnsi="Times  New Roman"/>
+                <w:sz w:val="28"/>
+                <w:szCs w:val="28"/>
+              </w:rPr>
             </w:pPr>
             <w:r>
               <w:rPr>
+                <w:rFonts w:ascii="Times  New Roman" w:hAnsi="Times  New Roman"/>
                 <w:color w:val="334155"/>
-                <w:sz w:val="18"/>
+                <w:sz w:val="28"/>
+                <w:szCs w:val="28"/>
               </w:rPr>
               <w:t>2</w:t>
             </w:r>
@@ -466,11 +689,20 @@
             </w:tcMar>
           </w:tcPr>
           <w:p>
+            <w:pPr>
+              <w:rPr>
+                <w:rFonts w:ascii="Times  New Roman" w:hAnsi="Times  New Roman"/>
+                <w:sz w:val="28"/>
+                <w:szCs w:val="28"/>
+              </w:rPr>
+            </w:pPr>
             <w:r>
               <w:rPr>
+                <w:rFonts w:ascii="Times  New Roman" w:hAnsi="Times  New Roman"/>
                 <w:b/>
                 <w:color w:val="1E3A5F"/>
-                <w:sz w:val="18"/>
+                <w:sz w:val="28"/>
+                <w:szCs w:val="28"/>
               </w:rPr>
               <w:t>Server State &amp; Caching (TanStack Query)</w:t>
             </w:r>
@@ -490,14 +722,31 @@
           <w:p>
             <w:pPr>
               <w:jc w:val="center"/>
+              <w:rPr>
+                <w:rFonts w:ascii="Times  New Roman" w:hAnsi="Times  New Roman"/>
+                <w:sz w:val="28"/>
+                <w:szCs w:val="28"/>
+              </w:rPr>
             </w:pPr>
             <w:r>
               <w:rPr>
+                <w:rFonts w:ascii="Segoe UI Emoji" w:hAnsi="Segoe UI Emoji" w:cs="Segoe UI Emoji"/>
                 <w:b/>
                 <w:color w:val="10B981"/>
-                <w:sz w:val="18"/>
+                <w:sz w:val="28"/>
+                <w:szCs w:val="28"/>
               </w:rPr>
-              <w:t>✅ Complete</w:t>
+              <w:t>✅</w:t>
+            </w:r>
+            <w:r>
+              <w:rPr>
+                <w:rFonts w:ascii="Times  New Roman" w:hAnsi="Times  New Roman"/>
+                <w:b/>
+                <w:color w:val="10B981"/>
+                <w:sz w:val="28"/>
+                <w:szCs w:val="28"/>
+              </w:rPr>
+              <w:t xml:space="preserve"> Complete</w:t>
             </w:r>
           </w:p>
         </w:tc>
@@ -513,10 +762,19 @@
             </w:tcMar>
           </w:tcPr>
           <w:p>
+            <w:pPr>
+              <w:rPr>
+                <w:rFonts w:ascii="Times  New Roman" w:hAnsi="Times  New Roman"/>
+                <w:sz w:val="28"/>
+                <w:szCs w:val="28"/>
+              </w:rPr>
+            </w:pPr>
             <w:r>
               <w:rPr>
+                <w:rFonts w:ascii="Times  New Roman" w:hAnsi="Times  New Roman"/>
                 <w:color w:val="334155"/>
-                <w:sz w:val="18"/>
+                <w:sz w:val="28"/>
+                <w:szCs w:val="28"/>
               </w:rPr>
               <w:t>Integrated @tanstack/react-query with QueryClientProvider (staleTime: 5min, gcTime: 10min). Custom hook useRooms() with pull-to-refresh on FlatList.</w:t>
             </w:r>
@@ -541,11 +799,18 @@
           <w:p>
             <w:pPr>
               <w:jc w:val="center"/>
+              <w:rPr>
+                <w:rFonts w:ascii="Times  New Roman" w:hAnsi="Times  New Roman"/>
+                <w:sz w:val="28"/>
+                <w:szCs w:val="28"/>
+              </w:rPr>
             </w:pPr>
             <w:r>
               <w:rPr>
+                <w:rFonts w:ascii="Times  New Roman" w:hAnsi="Times  New Roman"/>
                 <w:color w:val="334155"/>
-                <w:sz w:val="18"/>
+                <w:sz w:val="28"/>
+                <w:szCs w:val="28"/>
               </w:rPr>
               <w:t>3</w:t>
             </w:r>
@@ -563,11 +828,20 @@
             </w:tcMar>
           </w:tcPr>
           <w:p>
+            <w:pPr>
+              <w:rPr>
+                <w:rFonts w:ascii="Times  New Roman" w:hAnsi="Times  New Roman"/>
+                <w:sz w:val="28"/>
+                <w:szCs w:val="28"/>
+              </w:rPr>
+            </w:pPr>
             <w:r>
               <w:rPr>
+                <w:rFonts w:ascii="Times  New Roman" w:hAnsi="Times  New Roman"/>
                 <w:b/>
                 <w:color w:val="1E3A5F"/>
-                <w:sz w:val="18"/>
+                <w:sz w:val="28"/>
+                <w:szCs w:val="28"/>
               </w:rPr>
               <w:t>Client State &amp; Persistence (Zustand)</w:t>
             </w:r>
@@ -587,14 +861,31 @@
           <w:p>
             <w:pPr>
               <w:jc w:val="center"/>
+              <w:rPr>
+                <w:rFonts w:ascii="Times  New Roman" w:hAnsi="Times  New Roman"/>
+                <w:sz w:val="28"/>
+                <w:szCs w:val="28"/>
+              </w:rPr>
             </w:pPr>
             <w:r>
               <w:rPr>
+                <w:rFonts w:ascii="Segoe UI Emoji" w:hAnsi="Segoe UI Emoji" w:cs="Segoe UI Emoji"/>
                 <w:b/>
                 <w:color w:val="10B981"/>
-                <w:sz w:val="18"/>
+                <w:sz w:val="28"/>
+                <w:szCs w:val="28"/>
               </w:rPr>
-              <w:t>✅ Complete</w:t>
+              <w:t>✅</w:t>
+            </w:r>
+            <w:r>
+              <w:rPr>
+                <w:rFonts w:ascii="Times  New Roman" w:hAnsi="Times  New Roman"/>
+                <w:b/>
+                <w:color w:val="10B981"/>
+                <w:sz w:val="28"/>
+                <w:szCs w:val="28"/>
+              </w:rPr>
+              <w:t xml:space="preserve"> Complete</w:t>
             </w:r>
           </w:p>
         </w:tc>
@@ -610,12 +901,31 @@
             </w:tcMar>
           </w:tcPr>
           <w:p>
+            <w:pPr>
+              <w:rPr>
+                <w:rFonts w:ascii="Times  New Roman" w:hAnsi="Times  New Roman"/>
+                <w:sz w:val="28"/>
+                <w:szCs w:val="28"/>
+              </w:rPr>
+            </w:pPr>
             <w:r>
               <w:rPr>
+                <w:rFonts w:ascii="Times  New Roman" w:hAnsi="Times  New Roman"/>
                 <w:color w:val="334155"/>
-                <w:sz w:val="18"/>
+                <w:sz w:val="28"/>
+                <w:szCs w:val="28"/>
               </w:rPr>
-              <w:t>Zustand store with persist middleware storing in @react-native-async-storage/async-storage under key 'vku-booking-storage'.</w:t>
+              <w:t xml:space="preserve">Zustand store with persist middleware storing in @react-native-async-storage/async-storage under </w:t>
+            </w:r>
+            <w:r>
+              <w:rPr>
+                <w:rFonts w:ascii="Times  New Roman" w:hAnsi="Times  New Roman"/>
+                <w:color w:val="334155"/>
+                <w:sz w:val="28"/>
+                <w:szCs w:val="28"/>
+              </w:rPr>
+              <w:lastRenderedPageBreak/>
+              <w:t>key 'vku-booking-storage'.</w:t>
             </w:r>
           </w:p>
         </w:tc>
@@ -638,12 +948,20 @@
           <w:p>
             <w:pPr>
               <w:jc w:val="center"/>
+              <w:rPr>
+                <w:rFonts w:ascii="Times  New Roman" w:hAnsi="Times  New Roman"/>
+                <w:sz w:val="28"/>
+                <w:szCs w:val="28"/>
+              </w:rPr>
             </w:pPr>
             <w:r>
               <w:rPr>
+                <w:rFonts w:ascii="Times  New Roman" w:hAnsi="Times  New Roman"/>
                 <w:color w:val="334155"/>
-                <w:sz w:val="18"/>
+                <w:sz w:val="28"/>
+                <w:szCs w:val="28"/>
               </w:rPr>
+              <w:lastRenderedPageBreak/>
               <w:t>4</w:t>
             </w:r>
           </w:p>
@@ -660,11 +978,20 @@
             </w:tcMar>
           </w:tcPr>
           <w:p>
+            <w:pPr>
+              <w:rPr>
+                <w:rFonts w:ascii="Times  New Roman" w:hAnsi="Times  New Roman"/>
+                <w:sz w:val="28"/>
+                <w:szCs w:val="28"/>
+              </w:rPr>
+            </w:pPr>
             <w:r>
               <w:rPr>
+                <w:rFonts w:ascii="Times  New Roman" w:hAnsi="Times  New Roman"/>
                 <w:b/>
                 <w:color w:val="1E3A5F"/>
-                <w:sz w:val="18"/>
+                <w:sz w:val="28"/>
+                <w:szCs w:val="28"/>
               </w:rPr>
               <w:t>Type-Safe Navigation (React Navigation 7)</w:t>
             </w:r>
@@ -684,14 +1011,31 @@
           <w:p>
             <w:pPr>
               <w:jc w:val="center"/>
+              <w:rPr>
+                <w:rFonts w:ascii="Times  New Roman" w:hAnsi="Times  New Roman"/>
+                <w:sz w:val="28"/>
+                <w:szCs w:val="28"/>
+              </w:rPr>
             </w:pPr>
             <w:r>
               <w:rPr>
+                <w:rFonts w:ascii="Segoe UI Emoji" w:hAnsi="Segoe UI Emoji" w:cs="Segoe UI Emoji"/>
                 <w:b/>
                 <w:color w:val="10B981"/>
-                <w:sz w:val="18"/>
+                <w:sz w:val="28"/>
+                <w:szCs w:val="28"/>
               </w:rPr>
-              <w:t>✅ Complete</w:t>
+              <w:t>✅</w:t>
+            </w:r>
+            <w:r>
+              <w:rPr>
+                <w:rFonts w:ascii="Times  New Roman" w:hAnsi="Times  New Roman"/>
+                <w:b/>
+                <w:color w:val="10B981"/>
+                <w:sz w:val="28"/>
+                <w:szCs w:val="28"/>
+              </w:rPr>
+              <w:t xml:space="preserve"> Complete</w:t>
             </w:r>
           </w:p>
         </w:tc>
@@ -707,10 +1051,19 @@
             </w:tcMar>
           </w:tcPr>
           <w:p>
+            <w:pPr>
+              <w:rPr>
+                <w:rFonts w:ascii="Times  New Roman" w:hAnsi="Times  New Roman"/>
+                <w:sz w:val="28"/>
+                <w:szCs w:val="28"/>
+              </w:rPr>
+            </w:pPr>
             <w:r>
               <w:rPr>
+                <w:rFonts w:ascii="Times  New Roman" w:hAnsi="Times  New Roman"/>
                 <w:color w:val="334155"/>
-                <w:sz w:val="18"/>
+                <w:sz w:val="28"/>
+                <w:szCs w:val="28"/>
               </w:rPr>
               <w:t>Nested Stack + Bottom Tabs architecture (RootNavigator + MainTabs) with strict TypeScript types (RootStackParamList, MainTabParamList).</w:t>
             </w:r>
@@ -735,11 +1088,18 @@
           <w:p>
             <w:pPr>
               <w:jc w:val="center"/>
+              <w:rPr>
+                <w:rFonts w:ascii="Times  New Roman" w:hAnsi="Times  New Roman"/>
+                <w:sz w:val="28"/>
+                <w:szCs w:val="28"/>
+              </w:rPr>
             </w:pPr>
             <w:r>
               <w:rPr>
+                <w:rFonts w:ascii="Times  New Roman" w:hAnsi="Times  New Roman"/>
                 <w:color w:val="334155"/>
-                <w:sz w:val="18"/>
+                <w:sz w:val="28"/>
+                <w:szCs w:val="28"/>
               </w:rPr>
               <w:t>5</w:t>
             </w:r>
@@ -757,11 +1117,20 @@
             </w:tcMar>
           </w:tcPr>
           <w:p>
+            <w:pPr>
+              <w:rPr>
+                <w:rFonts w:ascii="Times  New Roman" w:hAnsi="Times  New Roman"/>
+                <w:sz w:val="28"/>
+                <w:szCs w:val="28"/>
+              </w:rPr>
+            </w:pPr>
             <w:r>
               <w:rPr>
+                <w:rFonts w:ascii="Times  New Roman" w:hAnsi="Times  New Roman"/>
                 <w:b/>
                 <w:color w:val="1E3A5F"/>
-                <w:sz w:val="18"/>
+                <w:sz w:val="28"/>
+                <w:szCs w:val="28"/>
               </w:rPr>
               <w:t>Instant Search &amp; Multi-Parameter Filter</w:t>
             </w:r>
@@ -781,14 +1150,31 @@
           <w:p>
             <w:pPr>
               <w:jc w:val="center"/>
+              <w:rPr>
+                <w:rFonts w:ascii="Times  New Roman" w:hAnsi="Times  New Roman"/>
+                <w:sz w:val="28"/>
+                <w:szCs w:val="28"/>
+              </w:rPr>
             </w:pPr>
             <w:r>
               <w:rPr>
+                <w:rFonts w:ascii="Segoe UI Emoji" w:hAnsi="Segoe UI Emoji" w:cs="Segoe UI Emoji"/>
                 <w:b/>
                 <w:color w:val="10B981"/>
-                <w:sz w:val="18"/>
+                <w:sz w:val="28"/>
+                <w:szCs w:val="28"/>
               </w:rPr>
-              <w:t>✅ Complete</w:t>
+              <w:t>✅</w:t>
+            </w:r>
+            <w:r>
+              <w:rPr>
+                <w:rFonts w:ascii="Times  New Roman" w:hAnsi="Times  New Roman"/>
+                <w:b/>
+                <w:color w:val="10B981"/>
+                <w:sz w:val="28"/>
+                <w:szCs w:val="28"/>
+              </w:rPr>
+              <w:t xml:space="preserve"> Complete</w:t>
             </w:r>
           </w:p>
         </w:tc>
@@ -804,10 +1190,19 @@
             </w:tcMar>
           </w:tcPr>
           <w:p>
+            <w:pPr>
+              <w:rPr>
+                <w:rFonts w:ascii="Times  New Roman" w:hAnsi="Times  New Roman"/>
+                <w:sz w:val="28"/>
+                <w:szCs w:val="28"/>
+              </w:rPr>
+            </w:pPr>
             <w:r>
               <w:rPr>
+                <w:rFonts w:ascii="Times  New Roman" w:hAnsi="Times  New Roman"/>
                 <w:color w:val="334155"/>
-                <w:sz w:val="18"/>
+                <w:sz w:val="28"/>
+                <w:szCs w:val="28"/>
               </w:rPr>
               <w:t>Real-time text search and filter chips by Building (A, B, C, V), Capacity (2–20), and Equipment (Projector, Whiteboard, High-spec PC, AC).</w:t>
             </w:r>
@@ -832,11 +1227,18 @@
           <w:p>
             <w:pPr>
               <w:jc w:val="center"/>
+              <w:rPr>
+                <w:rFonts w:ascii="Times  New Roman" w:hAnsi="Times  New Roman"/>
+                <w:sz w:val="28"/>
+                <w:szCs w:val="28"/>
+              </w:rPr>
             </w:pPr>
             <w:r>
               <w:rPr>
+                <w:rFonts w:ascii="Times  New Roman" w:hAnsi="Times  New Roman"/>
                 <w:color w:val="334155"/>
-                <w:sz w:val="18"/>
+                <w:sz w:val="28"/>
+                <w:szCs w:val="28"/>
               </w:rPr>
               <w:t>6</w:t>
             </w:r>
@@ -854,11 +1256,20 @@
             </w:tcMar>
           </w:tcPr>
           <w:p>
+            <w:pPr>
+              <w:rPr>
+                <w:rFonts w:ascii="Times  New Roman" w:hAnsi="Times  New Roman"/>
+                <w:sz w:val="28"/>
+                <w:szCs w:val="28"/>
+              </w:rPr>
+            </w:pPr>
             <w:r>
               <w:rPr>
+                <w:rFonts w:ascii="Times  New Roman" w:hAnsi="Times  New Roman"/>
                 <w:b/>
                 <w:color w:val="1E3A5F"/>
-                <w:sz w:val="18"/>
+                <w:sz w:val="28"/>
+                <w:szCs w:val="28"/>
               </w:rPr>
               <w:t>7-Day Rolling Horizon &amp; Discrete Slots</w:t>
             </w:r>
@@ -878,14 +1289,31 @@
           <w:p>
             <w:pPr>
               <w:jc w:val="center"/>
+              <w:rPr>
+                <w:rFonts w:ascii="Times  New Roman" w:hAnsi="Times  New Roman"/>
+                <w:sz w:val="28"/>
+                <w:szCs w:val="28"/>
+              </w:rPr>
             </w:pPr>
             <w:r>
               <w:rPr>
+                <w:rFonts w:ascii="Segoe UI Emoji" w:hAnsi="Segoe UI Emoji" w:cs="Segoe UI Emoji"/>
                 <w:b/>
                 <w:color w:val="10B981"/>
-                <w:sz w:val="18"/>
+                <w:sz w:val="28"/>
+                <w:szCs w:val="28"/>
               </w:rPr>
-              <w:t>✅ Complete</w:t>
+              <w:t>✅</w:t>
+            </w:r>
+            <w:r>
+              <w:rPr>
+                <w:rFonts w:ascii="Times  New Roman" w:hAnsi="Times  New Roman"/>
+                <w:b/>
+                <w:color w:val="10B981"/>
+                <w:sz w:val="28"/>
+                <w:szCs w:val="28"/>
+              </w:rPr>
+              <w:t xml:space="preserve"> Complete</w:t>
             </w:r>
           </w:p>
         </w:tc>
@@ -901,10 +1329,19 @@
             </w:tcMar>
           </w:tcPr>
           <w:p>
+            <w:pPr>
+              <w:rPr>
+                <w:rFonts w:ascii="Times  New Roman" w:hAnsi="Times  New Roman"/>
+                <w:sz w:val="28"/>
+                <w:szCs w:val="28"/>
+              </w:rPr>
+            </w:pPr>
             <w:r>
               <w:rPr>
+                <w:rFonts w:ascii="Times  New Roman" w:hAnsi="Times  New Roman"/>
                 <w:color w:val="334155"/>
-                <w:sz w:val="18"/>
+                <w:sz w:val="28"/>
+                <w:szCs w:val="28"/>
               </w:rPr>
               <w:t>Interactive date selector for 7 days ahead; 4 discrete 2-hour daily sessions (07:30–09:30, 09:30–11:30, 13:00–15:00, 15:00–17:00).</w:t>
             </w:r>
@@ -929,13 +1366,19 @@
           <w:p>
             <w:pPr>
               <w:jc w:val="center"/>
+              <w:rPr>
+                <w:rFonts w:ascii="Times  New Roman" w:hAnsi="Times  New Roman"/>
+                <w:sz w:val="28"/>
+                <w:szCs w:val="28"/>
+              </w:rPr>
             </w:pPr>
             <w:r>
               <w:rPr>
+                <w:rFonts w:ascii="Times  New Roman" w:hAnsi="Times  New Roman"/>
                 <w:color w:val="334155"/>
-                <w:sz w:val="18"/>
+                <w:sz w:val="28"/>
+                <w:szCs w:val="28"/>
               </w:rPr>
-              <w:lastRenderedPageBreak/>
               <w:t>7</w:t>
             </w:r>
           </w:p>
@@ -952,11 +1395,20 @@
             </w:tcMar>
           </w:tcPr>
           <w:p>
+            <w:pPr>
+              <w:rPr>
+                <w:rFonts w:ascii="Times  New Roman" w:hAnsi="Times  New Roman"/>
+                <w:sz w:val="28"/>
+                <w:szCs w:val="28"/>
+              </w:rPr>
+            </w:pPr>
             <w:r>
               <w:rPr>
+                <w:rFonts w:ascii="Times  New Roman" w:hAnsi="Times  New Roman"/>
                 <w:b/>
                 <w:color w:val="1E3A5F"/>
-                <w:sz w:val="18"/>
+                <w:sz w:val="28"/>
+                <w:szCs w:val="28"/>
               </w:rPr>
               <w:t>90-Second Soft Hold &amp; Realtime Sync</w:t>
             </w:r>
@@ -976,14 +1428,31 @@
           <w:p>
             <w:pPr>
               <w:jc w:val="center"/>
+              <w:rPr>
+                <w:rFonts w:ascii="Times  New Roman" w:hAnsi="Times  New Roman"/>
+                <w:sz w:val="28"/>
+                <w:szCs w:val="28"/>
+              </w:rPr>
             </w:pPr>
             <w:r>
               <w:rPr>
+                <w:rFonts w:ascii="Segoe UI Emoji" w:hAnsi="Segoe UI Emoji" w:cs="Segoe UI Emoji"/>
                 <w:b/>
                 <w:color w:val="10B981"/>
-                <w:sz w:val="18"/>
+                <w:sz w:val="28"/>
+                <w:szCs w:val="28"/>
               </w:rPr>
-              <w:t>✅ Complete</w:t>
+              <w:t>✅</w:t>
+            </w:r>
+            <w:r>
+              <w:rPr>
+                <w:rFonts w:ascii="Times  New Roman" w:hAnsi="Times  New Roman"/>
+                <w:b/>
+                <w:color w:val="10B981"/>
+                <w:sz w:val="28"/>
+                <w:szCs w:val="28"/>
+              </w:rPr>
+              <w:t xml:space="preserve"> Complete</w:t>
             </w:r>
           </w:p>
         </w:tc>
@@ -999,10 +1468,19 @@
             </w:tcMar>
           </w:tcPr>
           <w:p>
+            <w:pPr>
+              <w:rPr>
+                <w:rFonts w:ascii="Times  New Roman" w:hAnsi="Times  New Roman"/>
+                <w:sz w:val="28"/>
+                <w:szCs w:val="28"/>
+              </w:rPr>
+            </w:pPr>
             <w:r>
               <w:rPr>
+                <w:rFonts w:ascii="Times  New Roman" w:hAnsi="Times  New Roman"/>
                 <w:color w:val="334155"/>
-                <w:sz w:val="18"/>
+                <w:sz w:val="28"/>
+                <w:szCs w:val="28"/>
               </w:rPr>
               <w:t>Instant reservation lock with 90s countdown modal; broadcasts HELD_BY_OTHER amber state to other peers via Supabase Realtime channels.</w:t>
             </w:r>
@@ -1027,11 +1505,18 @@
           <w:p>
             <w:pPr>
               <w:jc w:val="center"/>
+              <w:rPr>
+                <w:rFonts w:ascii="Times  New Roman" w:hAnsi="Times  New Roman"/>
+                <w:sz w:val="28"/>
+                <w:szCs w:val="28"/>
+              </w:rPr>
             </w:pPr>
             <w:r>
               <w:rPr>
+                <w:rFonts w:ascii="Times  New Roman" w:hAnsi="Times  New Roman"/>
                 <w:color w:val="334155"/>
-                <w:sz w:val="18"/>
+                <w:sz w:val="28"/>
+                <w:szCs w:val="28"/>
               </w:rPr>
               <w:t>8</w:t>
             </w:r>
@@ -1049,11 +1534,20 @@
             </w:tcMar>
           </w:tcPr>
           <w:p>
+            <w:pPr>
+              <w:rPr>
+                <w:rFonts w:ascii="Times  New Roman" w:hAnsi="Times  New Roman"/>
+                <w:sz w:val="28"/>
+                <w:szCs w:val="28"/>
+              </w:rPr>
+            </w:pPr>
             <w:r>
               <w:rPr>
+                <w:rFonts w:ascii="Times  New Roman" w:hAnsi="Times  New Roman"/>
                 <w:b/>
                 <w:color w:val="1E3A5F"/>
-                <w:sz w:val="18"/>
+                <w:sz w:val="28"/>
+                <w:szCs w:val="28"/>
               </w:rPr>
               <w:t>Concurrency &amp; Anti-Collision Engine</w:t>
             </w:r>
@@ -1073,14 +1567,31 @@
           <w:p>
             <w:pPr>
               <w:jc w:val="center"/>
+              <w:rPr>
+                <w:rFonts w:ascii="Times  New Roman" w:hAnsi="Times  New Roman"/>
+                <w:sz w:val="28"/>
+                <w:szCs w:val="28"/>
+              </w:rPr>
             </w:pPr>
             <w:r>
               <w:rPr>
+                <w:rFonts w:ascii="Segoe UI Emoji" w:hAnsi="Segoe UI Emoji" w:cs="Segoe UI Emoji"/>
                 <w:b/>
                 <w:color w:val="10B981"/>
-                <w:sz w:val="18"/>
+                <w:sz w:val="28"/>
+                <w:szCs w:val="28"/>
               </w:rPr>
-              <w:t>✅ Complete</w:t>
+              <w:t>✅</w:t>
+            </w:r>
+            <w:r>
+              <w:rPr>
+                <w:rFonts w:ascii="Times  New Roman" w:hAnsi="Times  New Roman"/>
+                <w:b/>
+                <w:color w:val="10B981"/>
+                <w:sz w:val="28"/>
+                <w:szCs w:val="28"/>
+              </w:rPr>
+              <w:t xml:space="preserve"> Complete</w:t>
             </w:r>
           </w:p>
         </w:tc>
@@ -1096,10 +1607,19 @@
             </w:tcMar>
           </w:tcPr>
           <w:p>
+            <w:pPr>
+              <w:rPr>
+                <w:rFonts w:ascii="Times  New Roman" w:hAnsi="Times  New Roman"/>
+                <w:sz w:val="28"/>
+                <w:szCs w:val="28"/>
+              </w:rPr>
+            </w:pPr>
             <w:r>
               <w:rPr>
+                <w:rFonts w:ascii="Times  New Roman" w:hAnsi="Times  New Roman"/>
                 <w:color w:val="334155"/>
-                <w:sz w:val="18"/>
+                <w:sz w:val="28"/>
+                <w:szCs w:val="28"/>
               </w:rPr>
               <w:t>Server-authoritative PostgreSQL advisory locking and partial unique index (idx_bookings_active_slot). Client-generated UUID tokens prevent replay duplicates.</w:t>
             </w:r>
@@ -1124,11 +1644,18 @@
           <w:p>
             <w:pPr>
               <w:jc w:val="center"/>
+              <w:rPr>
+                <w:rFonts w:ascii="Times  New Roman" w:hAnsi="Times  New Roman"/>
+                <w:sz w:val="28"/>
+                <w:szCs w:val="28"/>
+              </w:rPr>
             </w:pPr>
             <w:r>
               <w:rPr>
+                <w:rFonts w:ascii="Times  New Roman" w:hAnsi="Times  New Roman"/>
                 <w:color w:val="334155"/>
-                <w:sz w:val="18"/>
+                <w:sz w:val="28"/>
+                <w:szCs w:val="28"/>
               </w:rPr>
               <w:t>9</w:t>
             </w:r>
@@ -1146,11 +1673,20 @@
             </w:tcMar>
           </w:tcPr>
           <w:p>
+            <w:pPr>
+              <w:rPr>
+                <w:rFonts w:ascii="Times  New Roman" w:hAnsi="Times  New Roman"/>
+                <w:sz w:val="28"/>
+                <w:szCs w:val="28"/>
+              </w:rPr>
+            </w:pPr>
             <w:r>
               <w:rPr>
+                <w:rFonts w:ascii="Times  New Roman" w:hAnsi="Times  New Roman"/>
                 <w:b/>
                 <w:color w:val="1E3A5F"/>
-                <w:sz w:val="18"/>
+                <w:sz w:val="28"/>
+                <w:szCs w:val="28"/>
               </w:rPr>
               <w:t>Offline Outbox &amp; Conflict Resolution</w:t>
             </w:r>
@@ -1170,14 +1706,31 @@
           <w:p>
             <w:pPr>
               <w:jc w:val="center"/>
+              <w:rPr>
+                <w:rFonts w:ascii="Times  New Roman" w:hAnsi="Times  New Roman"/>
+                <w:sz w:val="28"/>
+                <w:szCs w:val="28"/>
+              </w:rPr>
             </w:pPr>
             <w:r>
               <w:rPr>
+                <w:rFonts w:ascii="Segoe UI Emoji" w:hAnsi="Segoe UI Emoji" w:cs="Segoe UI Emoji"/>
                 <w:b/>
                 <w:color w:val="10B981"/>
-                <w:sz w:val="18"/>
+                <w:sz w:val="28"/>
+                <w:szCs w:val="28"/>
               </w:rPr>
-              <w:t>✅ Complete</w:t>
+              <w:t>✅</w:t>
+            </w:r>
+            <w:r>
+              <w:rPr>
+                <w:rFonts w:ascii="Times  New Roman" w:hAnsi="Times  New Roman"/>
+                <w:b/>
+                <w:color w:val="10B981"/>
+                <w:sz w:val="28"/>
+                <w:szCs w:val="28"/>
+              </w:rPr>
+              <w:t xml:space="preserve"> Complete</w:t>
             </w:r>
           </w:p>
         </w:tc>
@@ -1193,10 +1746,19 @@
             </w:tcMar>
           </w:tcPr>
           <w:p>
+            <w:pPr>
+              <w:rPr>
+                <w:rFonts w:ascii="Times  New Roman" w:hAnsi="Times  New Roman"/>
+                <w:sz w:val="28"/>
+                <w:szCs w:val="28"/>
+              </w:rPr>
+            </w:pPr>
             <w:r>
               <w:rPr>
+                <w:rFonts w:ascii="Times  New Roman" w:hAnsi="Times  New Roman"/>
                 <w:color w:val="334155"/>
-                <w:sz w:val="18"/>
+                <w:sz w:val="28"/>
+                <w:szCs w:val="28"/>
               </w:rPr>
               <w:t>Offline booking requests queued in an outbox (PENDING_SYNC) and flushed sequentially upon reconnection with deterministic conflict handling.</w:t>
             </w:r>
@@ -1221,12 +1783,20 @@
           <w:p>
             <w:pPr>
               <w:jc w:val="center"/>
+              <w:rPr>
+                <w:rFonts w:ascii="Times  New Roman" w:hAnsi="Times  New Roman"/>
+                <w:sz w:val="28"/>
+                <w:szCs w:val="28"/>
+              </w:rPr>
             </w:pPr>
             <w:r>
               <w:rPr>
+                <w:rFonts w:ascii="Times  New Roman" w:hAnsi="Times  New Roman"/>
                 <w:color w:val="334155"/>
-                <w:sz w:val="18"/>
+                <w:sz w:val="28"/>
+                <w:szCs w:val="28"/>
               </w:rPr>
+              <w:lastRenderedPageBreak/>
               <w:t>10</w:t>
             </w:r>
           </w:p>
@@ -1243,11 +1813,20 @@
             </w:tcMar>
           </w:tcPr>
           <w:p>
+            <w:pPr>
+              <w:rPr>
+                <w:rFonts w:ascii="Times  New Roman" w:hAnsi="Times  New Roman"/>
+                <w:sz w:val="28"/>
+                <w:szCs w:val="28"/>
+              </w:rPr>
+            </w:pPr>
             <w:r>
               <w:rPr>
+                <w:rFonts w:ascii="Times  New Roman" w:hAnsi="Times  New Roman"/>
                 <w:b/>
                 <w:color w:val="1E3A5F"/>
-                <w:sz w:val="18"/>
+                <w:sz w:val="28"/>
+                <w:szCs w:val="28"/>
               </w:rPr>
               <w:t>QR Check-in Pass &amp; Local Notifications</w:t>
             </w:r>
@@ -1267,14 +1846,31 @@
           <w:p>
             <w:pPr>
               <w:jc w:val="center"/>
+              <w:rPr>
+                <w:rFonts w:ascii="Times  New Roman" w:hAnsi="Times  New Roman"/>
+                <w:sz w:val="28"/>
+                <w:szCs w:val="28"/>
+              </w:rPr>
             </w:pPr>
             <w:r>
               <w:rPr>
+                <w:rFonts w:ascii="Segoe UI Emoji" w:hAnsi="Segoe UI Emoji" w:cs="Segoe UI Emoji"/>
                 <w:b/>
                 <w:color w:val="10B981"/>
-                <w:sz w:val="18"/>
+                <w:sz w:val="28"/>
+                <w:szCs w:val="28"/>
               </w:rPr>
-              <w:t>✅ Complete</w:t>
+              <w:t>✅</w:t>
+            </w:r>
+            <w:r>
+              <w:rPr>
+                <w:rFonts w:ascii="Times  New Roman" w:hAnsi="Times  New Roman"/>
+                <w:b/>
+                <w:color w:val="10B981"/>
+                <w:sz w:val="28"/>
+                <w:szCs w:val="28"/>
+              </w:rPr>
+              <w:t xml:space="preserve"> Complete</w:t>
             </w:r>
           </w:p>
         </w:tc>
@@ -1290,10 +1886,19 @@
             </w:tcMar>
           </w:tcPr>
           <w:p>
+            <w:pPr>
+              <w:rPr>
+                <w:rFonts w:ascii="Times  New Roman" w:hAnsi="Times  New Roman"/>
+                <w:sz w:val="28"/>
+                <w:szCs w:val="28"/>
+              </w:rPr>
+            </w:pPr>
             <w:r>
               <w:rPr>
+                <w:rFonts w:ascii="Times  New Roman" w:hAnsi="Times  New Roman"/>
                 <w:color w:val="334155"/>
-                <w:sz w:val="18"/>
+                <w:sz w:val="28"/>
+                <w:szCs w:val="28"/>
               </w:rPr>
               <w:t>Interactive check-in pass powered by react-native-qrcode-svg; scheduled 15-minute countdown reminders via expo-notifications.</w:t>
             </w:r>
@@ -1318,11 +1923,18 @@
           <w:p>
             <w:pPr>
               <w:jc w:val="center"/>
+              <w:rPr>
+                <w:rFonts w:ascii="Times  New Roman" w:hAnsi="Times  New Roman"/>
+                <w:sz w:val="28"/>
+                <w:szCs w:val="28"/>
+              </w:rPr>
             </w:pPr>
             <w:r>
               <w:rPr>
+                <w:rFonts w:ascii="Times  New Roman" w:hAnsi="Times  New Roman"/>
                 <w:color w:val="334155"/>
-                <w:sz w:val="18"/>
+                <w:sz w:val="28"/>
+                <w:szCs w:val="28"/>
               </w:rPr>
               <w:t>11</w:t>
             </w:r>
@@ -1340,11 +1952,20 @@
             </w:tcMar>
           </w:tcPr>
           <w:p>
+            <w:pPr>
+              <w:rPr>
+                <w:rFonts w:ascii="Times  New Roman" w:hAnsi="Times  New Roman"/>
+                <w:sz w:val="28"/>
+                <w:szCs w:val="28"/>
+              </w:rPr>
+            </w:pPr>
             <w:r>
               <w:rPr>
+                <w:rFonts w:ascii="Times  New Roman" w:hAnsi="Times  New Roman"/>
                 <w:b/>
                 <w:color w:val="1E3A5F"/>
-                <w:sz w:val="18"/>
+                <w:sz w:val="28"/>
+                <w:szCs w:val="28"/>
               </w:rPr>
               <w:t>Layout Animations (Reanimated 3/4)</w:t>
             </w:r>
@@ -1364,14 +1985,31 @@
           <w:p>
             <w:pPr>
               <w:jc w:val="center"/>
+              <w:rPr>
+                <w:rFonts w:ascii="Times  New Roman" w:hAnsi="Times  New Roman"/>
+                <w:sz w:val="28"/>
+                <w:szCs w:val="28"/>
+              </w:rPr>
             </w:pPr>
             <w:r>
               <w:rPr>
+                <w:rFonts w:ascii="Segoe UI Emoji" w:hAnsi="Segoe UI Emoji" w:cs="Segoe UI Emoji"/>
                 <w:b/>
                 <w:color w:val="10B981"/>
-                <w:sz w:val="18"/>
+                <w:sz w:val="28"/>
+                <w:szCs w:val="28"/>
               </w:rPr>
-              <w:t>✅ Complete</w:t>
+              <w:t>✅</w:t>
+            </w:r>
+            <w:r>
+              <w:rPr>
+                <w:rFonts w:ascii="Times  New Roman" w:hAnsi="Times  New Roman"/>
+                <w:b/>
+                <w:color w:val="10B981"/>
+                <w:sz w:val="28"/>
+                <w:szCs w:val="28"/>
+              </w:rPr>
+              <w:t xml:space="preserve"> Complete</w:t>
             </w:r>
           </w:p>
         </w:tc>
@@ -1387,10 +2025,19 @@
             </w:tcMar>
           </w:tcPr>
           <w:p>
+            <w:pPr>
+              <w:rPr>
+                <w:rFonts w:ascii="Times  New Roman" w:hAnsi="Times  New Roman"/>
+                <w:sz w:val="28"/>
+                <w:szCs w:val="28"/>
+              </w:rPr>
+            </w:pPr>
             <w:r>
               <w:rPr>
+                <w:rFonts w:ascii="Times  New Roman" w:hAnsi="Times  New Roman"/>
                 <w:color w:val="334155"/>
-                <w:sz w:val="18"/>
+                <w:sz w:val="28"/>
+                <w:szCs w:val="28"/>
               </w:rPr>
               <w:t>Staggered entrance animations on room feed using FadeInDown.delay(index * 60).springify() and spring physics on interactions.</w:t>
             </w:r>
@@ -1402,9 +2049,13 @@
       <w:pPr>
         <w:pStyle w:val="u1"/>
         <w:spacing w:before="320" w:after="120"/>
+        <w:rPr>
+          <w:rFonts w:ascii="Times  New Roman" w:hAnsi="Times  New Roman"/>
+        </w:rPr>
       </w:pPr>
       <w:r>
         <w:rPr>
+          <w:rFonts w:ascii="Times  New Roman" w:hAnsi="Times  New Roman"/>
           <w:color w:val="1E3A5F"/>
         </w:rPr>
         <w:t>3. TECHNICAL ARCHITECTURE &amp; PROJECT STRUCTURE</w:t>
@@ -1413,11 +2064,19 @@
     <w:p>
       <w:pPr>
         <w:spacing w:after="80"/>
+        <w:rPr>
+          <w:rFonts w:ascii="Times  New Roman" w:hAnsi="Times  New Roman"/>
+          <w:sz w:val="28"/>
+          <w:szCs w:val="28"/>
+        </w:rPr>
       </w:pPr>
       <w:r>
         <w:rPr>
+          <w:rFonts w:ascii="Times  New Roman" w:hAnsi="Times  New Roman"/>
           <w:b/>
           <w:color w:val="0284C7"/>
+          <w:sz w:val="28"/>
+          <w:szCs w:val="28"/>
         </w:rPr>
         <w:t>3.1 Directory Organization</w:t>
       </w:r>
@@ -1425,182 +2084,216 @@
     <w:p>
       <w:pPr>
         <w:spacing w:after="120"/>
+        <w:rPr>
+          <w:rFonts w:ascii="Times  New Roman" w:hAnsi="Times  New Roman"/>
+          <w:sz w:val="28"/>
+          <w:szCs w:val="28"/>
+        </w:rPr>
       </w:pPr>
       <w:r>
         <w:rPr>
-          <w:rFonts w:ascii="Consolas" w:hAnsi="Consolas"/>
+          <w:rFonts w:ascii="Times  New Roman" w:hAnsi="Times  New Roman"/>
           <w:color w:val="1E293B"/>
-          <w:sz w:val="16"/>
+          <w:sz w:val="28"/>
+          <w:szCs w:val="28"/>
         </w:rPr>
         <w:t>vku-study-room/</w:t>
       </w:r>
       <w:r>
         <w:rPr>
-          <w:rFonts w:ascii="Consolas" w:hAnsi="Consolas"/>
+          <w:rFonts w:ascii="Times  New Roman" w:hAnsi="Times  New Roman"/>
           <w:color w:val="1E293B"/>
-          <w:sz w:val="16"/>
+          <w:sz w:val="28"/>
+          <w:szCs w:val="28"/>
         </w:rPr>
         <w:br/>
         <w:t>├── App.tsx                     # Entrypoint with Safe Area, QueryProvider &amp; RootNavigator</w:t>
       </w:r>
       <w:r>
         <w:rPr>
-          <w:rFonts w:ascii="Consolas" w:hAnsi="Consolas"/>
+          <w:rFonts w:ascii="Times  New Roman" w:hAnsi="Times  New Roman"/>
           <w:color w:val="1E293B"/>
-          <w:sz w:val="16"/>
+          <w:sz w:val="28"/>
+          <w:szCs w:val="28"/>
         </w:rPr>
         <w:br/>
         <w:t>├── app.json                    # Expo Managed configuration &amp; asset definitions</w:t>
       </w:r>
       <w:r>
         <w:rPr>
-          <w:rFonts w:ascii="Consolas" w:hAnsi="Consolas"/>
+          <w:rFonts w:ascii="Times  New Roman" w:hAnsi="Times  New Roman"/>
           <w:color w:val="1E293B"/>
-          <w:sz w:val="16"/>
+          <w:sz w:val="28"/>
+          <w:szCs w:val="28"/>
         </w:rPr>
         <w:br/>
         <w:t>├── wrangler.jsonc              # Cloudflare Workers Static Assets deployment config</w:t>
       </w:r>
       <w:r>
         <w:rPr>
-          <w:rFonts w:ascii="Consolas" w:hAnsi="Consolas"/>
+          <w:rFonts w:ascii="Times  New Roman" w:hAnsi="Times  New Roman"/>
           <w:color w:val="1E293B"/>
-          <w:sz w:val="16"/>
+          <w:sz w:val="28"/>
+          <w:szCs w:val="28"/>
         </w:rPr>
         <w:br/>
         <w:t>├── src/</w:t>
       </w:r>
       <w:r>
         <w:rPr>
-          <w:rFonts w:ascii="Consolas" w:hAnsi="Consolas"/>
+          <w:rFonts w:ascii="Times  New Roman" w:hAnsi="Times  New Roman"/>
           <w:color w:val="1E293B"/>
-          <w:sz w:val="16"/>
+          <w:sz w:val="28"/>
+          <w:szCs w:val="28"/>
         </w:rPr>
         <w:br/>
         <w:t>│   ├── components/             # Reusable UI components (RoomCard, SearchBar, FilterChips, Modal)</w:t>
       </w:r>
       <w:r>
         <w:rPr>
-          <w:rFonts w:ascii="Consolas" w:hAnsi="Consolas"/>
+          <w:rFonts w:ascii="Times  New Roman" w:hAnsi="Times  New Roman"/>
           <w:color w:val="1E293B"/>
-          <w:sz w:val="16"/>
+          <w:sz w:val="28"/>
+          <w:szCs w:val="28"/>
         </w:rPr>
         <w:br/>
         <w:t>│   ├── config/                 # Environment variables and runtime mode detection</w:t>
       </w:r>
       <w:r>
         <w:rPr>
-          <w:rFonts w:ascii="Consolas" w:hAnsi="Consolas"/>
+          <w:rFonts w:ascii="Times  New Roman" w:hAnsi="Times  New Roman"/>
           <w:color w:val="1E293B"/>
-          <w:sz w:val="16"/>
+          <w:sz w:val="28"/>
+          <w:szCs w:val="28"/>
         </w:rPr>
         <w:br/>
         <w:t>│   ├── hooks/                  # Custom hooks (useRooms, useResponsiveLayout, useRoomAvailability)</w:t>
       </w:r>
       <w:r>
         <w:rPr>
-          <w:rFonts w:ascii="Consolas" w:hAnsi="Consolas"/>
+          <w:rFonts w:ascii="Times  New Roman" w:hAnsi="Times  New Roman"/>
           <w:color w:val="1E293B"/>
-          <w:sz w:val="16"/>
+          <w:sz w:val="28"/>
+          <w:szCs w:val="28"/>
         </w:rPr>
         <w:br/>
         <w:t>│   ├── i18n/                   # Multi-language dictionary (Vietnamese &amp; English)</w:t>
       </w:r>
       <w:r>
         <w:rPr>
-          <w:rFonts w:ascii="Consolas" w:hAnsi="Consolas"/>
+          <w:rFonts w:ascii="Times  New Roman" w:hAnsi="Times  New Roman"/>
           <w:color w:val="1E293B"/>
-          <w:sz w:val="16"/>
+          <w:sz w:val="28"/>
+          <w:szCs w:val="28"/>
         </w:rPr>
         <w:br/>
         <w:t>│   ├── navigation/             # Type-safe navigators (RootNavigator, MainTabs, types.ts)</w:t>
       </w:r>
       <w:r>
         <w:rPr>
-          <w:rFonts w:ascii="Consolas" w:hAnsi="Consolas"/>
+          <w:rFonts w:ascii="Times  New Roman" w:hAnsi="Times  New Roman"/>
           <w:color w:val="1E293B"/>
-          <w:sz w:val="16"/>
+          <w:sz w:val="28"/>
+          <w:szCs w:val="28"/>
         </w:rPr>
         <w:br/>
         <w:t>│   ├── providers/              # TanStack QueryClientProvider configuration</w:t>
       </w:r>
       <w:r>
         <w:rPr>
-          <w:rFonts w:ascii="Consolas" w:hAnsi="Consolas"/>
+          <w:rFonts w:ascii="Times  New Roman" w:hAnsi="Times  New Roman"/>
           <w:color w:val="1E293B"/>
-          <w:sz w:val="16"/>
+          <w:sz w:val="28"/>
+          <w:szCs w:val="28"/>
         </w:rPr>
         <w:br/>
         <w:t>│   ├── screens/                # Core screens (RoomListScreen, RoomDetailScreen, MyBookingsScreen, ProfileScreen)</w:t>
       </w:r>
       <w:r>
         <w:rPr>
-          <w:rFonts w:ascii="Consolas" w:hAnsi="Consolas"/>
+          <w:rFonts w:ascii="Times  New Roman" w:hAnsi="Times  New Roman"/>
           <w:color w:val="1E293B"/>
-          <w:sz w:val="16"/>
+          <w:sz w:val="28"/>
+          <w:szCs w:val="28"/>
         </w:rPr>
         <w:br/>
         <w:t>│   ├── services/               # Abstraction layer (Supabase, Mock, Outbox Sync, Notifications)</w:t>
       </w:r>
       <w:r>
         <w:rPr>
-          <w:rFonts w:ascii="Consolas" w:hAnsi="Consolas"/>
+          <w:rFonts w:ascii="Times  New Roman" w:hAnsi="Times  New Roman"/>
           <w:color w:val="1E293B"/>
-          <w:sz w:val="16"/>
+          <w:sz w:val="28"/>
+          <w:szCs w:val="28"/>
         </w:rPr>
         <w:br/>
         <w:t>│   ├── store/                  # Zustand stores (useBookingStore with persist, useAuthStore, useLanguageStore)</w:t>
       </w:r>
       <w:r>
         <w:rPr>
-          <w:rFonts w:ascii="Consolas" w:hAnsi="Consolas"/>
+          <w:rFonts w:ascii="Times  New Roman" w:hAnsi="Times  New Roman"/>
           <w:color w:val="1E293B"/>
-          <w:sz w:val="16"/>
+          <w:sz w:val="28"/>
+          <w:szCs w:val="28"/>
         </w:rPr>
         <w:br/>
         <w:t>│   ├── theme/                  # Design tokens, typography, and VKU color palettes</w:t>
       </w:r>
       <w:r>
         <w:rPr>
-          <w:rFonts w:ascii="Consolas" w:hAnsi="Consolas"/>
+          <w:rFonts w:ascii="Times  New Roman" w:hAnsi="Times  New Roman"/>
           <w:color w:val="1E293B"/>
-          <w:sz w:val="16"/>
+          <w:sz w:val="28"/>
+          <w:szCs w:val="28"/>
         </w:rPr>
         <w:br/>
+      </w:r>
+      <w:r>
+        <w:rPr>
+          <w:rFonts w:ascii="Times  New Roman" w:hAnsi="Times  New Roman"/>
+          <w:color w:val="1E293B"/>
+          <w:sz w:val="28"/>
+          <w:szCs w:val="28"/>
+        </w:rPr>
+        <w:lastRenderedPageBreak/>
         <w:t>│   └── types/                  # Strict TypeScript domain interfaces</w:t>
       </w:r>
       <w:r>
         <w:rPr>
-          <w:rFonts w:ascii="Consolas" w:hAnsi="Consolas"/>
+          <w:rFonts w:ascii="Times  New Roman" w:hAnsi="Times  New Roman"/>
           <w:color w:val="1E293B"/>
-          <w:sz w:val="16"/>
+          <w:sz w:val="28"/>
+          <w:szCs w:val="28"/>
         </w:rPr>
         <w:br/>
         <w:t>├── supabase/</w:t>
       </w:r>
       <w:r>
         <w:rPr>
-          <w:rFonts w:ascii="Consolas" w:hAnsi="Consolas"/>
+          <w:rFonts w:ascii="Times  New Roman" w:hAnsi="Times  New Roman"/>
           <w:color w:val="1E293B"/>
-          <w:sz w:val="16"/>
+          <w:sz w:val="28"/>
+          <w:szCs w:val="28"/>
         </w:rPr>
         <w:br/>
         <w:t>│   ├── schema.sql              # PostgreSQL DDL, advisory lock RPC, and RLS policies</w:t>
       </w:r>
       <w:r>
         <w:rPr>
-          <w:rFonts w:ascii="Consolas" w:hAnsi="Consolas"/>
+          <w:rFonts w:ascii="Times  New Roman" w:hAnsi="Times  New Roman"/>
           <w:color w:val="1E293B"/>
-          <w:sz w:val="16"/>
+          <w:sz w:val="28"/>
+          <w:szCs w:val="28"/>
         </w:rPr>
         <w:br/>
         <w:t>│   └── seed.sql                # 20 pre-seeded study rooms across 4 VKU campus buildings</w:t>
       </w:r>
       <w:r>
         <w:rPr>
-          <w:rFonts w:ascii="Consolas" w:hAnsi="Consolas"/>
+          <w:rFonts w:ascii="Times  New Roman" w:hAnsi="Times  New Roman"/>
           <w:color w:val="1E293B"/>
-          <w:sz w:val="16"/>
+          <w:sz w:val="28"/>
+          <w:szCs w:val="28"/>
         </w:rPr>
         <w:br/>
         <w:t>└── test/                       # Node.js automated verification harness (Concurrency, Outbox, Auth, QR)</w:t>
@@ -1609,11 +2302,19 @@
     <w:p>
       <w:pPr>
         <w:spacing w:after="80"/>
+        <w:rPr>
+          <w:rFonts w:ascii="Times  New Roman" w:hAnsi="Times  New Roman"/>
+          <w:sz w:val="28"/>
+          <w:szCs w:val="28"/>
+        </w:rPr>
       </w:pPr>
       <w:r>
         <w:rPr>
+          <w:rFonts w:ascii="Times  New Roman" w:hAnsi="Times  New Roman"/>
           <w:b/>
           <w:color w:val="0284C7"/>
+          <w:sz w:val="28"/>
+          <w:szCs w:val="28"/>
         </w:rPr>
         <w:t>3.2 State Management &amp; Data Flow Architecture</w:t>
       </w:r>
@@ -1622,17 +2323,28 @@
       <w:pPr>
         <w:pStyle w:val="Duudong"/>
         <w:spacing w:after="40"/>
+        <w:rPr>
+          <w:rFonts w:ascii="Times  New Roman" w:hAnsi="Times  New Roman"/>
+          <w:sz w:val="28"/>
+          <w:szCs w:val="28"/>
+        </w:rPr>
       </w:pPr>
       <w:r>
         <w:rPr>
+          <w:rFonts w:ascii="Times  New Roman" w:hAnsi="Times  New Roman"/>
           <w:b/>
           <w:color w:val="1E3A5F"/>
+          <w:sz w:val="28"/>
+          <w:szCs w:val="28"/>
         </w:rPr>
         <w:t xml:space="preserve">Server State (TanStack Query): </w:t>
       </w:r>
       <w:r>
         <w:rPr>
+          <w:rFonts w:ascii="Times  New Roman" w:hAnsi="Times  New Roman"/>
           <w:color w:val="334155"/>
+          <w:sz w:val="28"/>
+          <w:szCs w:val="28"/>
         </w:rPr>
         <w:t>Manages remote entity caches ('rooms') with a 5-minute staleTime, automated background synchronization, and zero-redundancy network refetching on pull-to-refresh.</w:t>
       </w:r>
@@ -1641,17 +2353,28 @@
       <w:pPr>
         <w:pStyle w:val="Duudong"/>
         <w:spacing w:after="40"/>
+        <w:rPr>
+          <w:rFonts w:ascii="Times  New Roman" w:hAnsi="Times  New Roman"/>
+          <w:sz w:val="28"/>
+          <w:szCs w:val="28"/>
+        </w:rPr>
       </w:pPr>
       <w:r>
         <w:rPr>
+          <w:rFonts w:ascii="Times  New Roman" w:hAnsi="Times  New Roman"/>
           <w:b/>
           <w:color w:val="1E3A5F"/>
+          <w:sz w:val="28"/>
+          <w:szCs w:val="28"/>
         </w:rPr>
         <w:t xml:space="preserve">Client State (Zustand): </w:t>
       </w:r>
       <w:r>
         <w:rPr>
+          <w:rFonts w:ascii="Times  New Roman" w:hAnsi="Times  New Roman"/>
           <w:color w:val="334155"/>
+          <w:sz w:val="28"/>
+          <w:szCs w:val="28"/>
         </w:rPr>
         <w:t>Manages volatile and local domain state (active reservations, active 90s hold session, outbox queue, filter parameters, and user authentication). All critical mutations persist immediately to device storage via @react-native-async-storage/async-storage ('vku-booking-storage').</w:t>
       </w:r>
@@ -1660,12 +2383,15 @@
       <w:pPr>
         <w:pStyle w:val="u1"/>
         <w:spacing w:before="320" w:after="120"/>
+        <w:rPr>
+          <w:rFonts w:ascii="Times  New Roman" w:hAnsi="Times  New Roman"/>
+        </w:rPr>
       </w:pPr>
       <w:r>
         <w:rPr>
+          <w:rFonts w:ascii="Times  New Roman" w:hAnsi="Times  New Roman"/>
           <w:color w:val="1E3A5F"/>
         </w:rPr>
-        <w:lastRenderedPageBreak/>
         <w:t>4. EMPIRICAL EVIDENCE &amp; SCREENSHOTS</w:t>
       </w:r>
     </w:p>
@@ -1673,17 +2399,28 @@
       <w:pPr>
         <w:pStyle w:val="Duudong"/>
         <w:spacing w:after="80"/>
+        <w:rPr>
+          <w:rFonts w:ascii="Times  New Roman" w:hAnsi="Times  New Roman"/>
+          <w:sz w:val="28"/>
+          <w:szCs w:val="28"/>
+        </w:rPr>
       </w:pPr>
       <w:r>
         <w:rPr>
+          <w:rFonts w:ascii="Times  New Roman" w:hAnsi="Times  New Roman"/>
           <w:b/>
           <w:color w:val="1E3A5F"/>
+          <w:sz w:val="28"/>
+          <w:szCs w:val="28"/>
         </w:rPr>
         <w:t xml:space="preserve">Room Discovery &amp; Multi-Parameter Filter (RoomListScreen): </w:t>
       </w:r>
       <w:r>
         <w:rPr>
+          <w:rFonts w:ascii="Times  New Roman" w:hAnsi="Times  New Roman"/>
           <w:color w:val="334155"/>
+          <w:sz w:val="28"/>
+          <w:szCs w:val="28"/>
         </w:rPr>
         <w:t>Displays 20 study rooms across Buildings A, B, C, and V in an adaptive 60 FPS grid. Features real-time filtering chips by building, seat capacity (2–20), and equipment tags with smooth staggered entry animations (FadeInDown.springify()).</w:t>
       </w:r>
@@ -1691,18 +2428,165 @@
     <w:p>
       <w:pPr>
         <w:pStyle w:val="Duudong"/>
+        <w:keepNext/>
+        <w:numPr>
+          <w:ilvl w:val="0"/>
+          <w:numId w:val="0"/>
+        </w:numPr>
         <w:spacing w:after="80"/>
+        <w:ind w:left="360"/>
+        <w:jc w:val="center"/>
+        <w:rPr>
+          <w:rFonts w:ascii="Times  New Roman" w:hAnsi="Times  New Roman"/>
+          <w:sz w:val="28"/>
+          <w:szCs w:val="28"/>
+        </w:rPr>
       </w:pPr>
       <w:r>
         <w:rPr>
+          <w:rFonts w:ascii="Times  New Roman" w:hAnsi="Times  New Roman"/>
+          <w:sz w:val="28"/>
+          <w:szCs w:val="28"/>
+        </w:rPr>
+        <w:drawing>
+          <wp:inline distT="0" distB="0" distL="0" distR="0" wp14:anchorId="7C9CCC2A" wp14:editId="19F470B7">
+            <wp:extent cx="3693511" cy="2880165"/>
+            <wp:effectExtent l="0" t="0" r="2540" b="0"/>
+            <wp:docPr id="1695260033" name="Hình ảnh 1"/>
+            <wp:cNvGraphicFramePr>
+              <a:graphicFrameLocks xmlns:a="http://schemas.openxmlformats.org/drawingml/2006/main" noChangeAspect="1"/>
+            </wp:cNvGraphicFramePr>
+            <a:graphic xmlns:a="http://schemas.openxmlformats.org/drawingml/2006/main">
+              <a:graphicData uri="http://schemas.openxmlformats.org/drawingml/2006/picture">
+                <pic:pic xmlns:pic="http://schemas.openxmlformats.org/drawingml/2006/picture">
+                  <pic:nvPicPr>
+                    <pic:cNvPr id="1695260033" name=""/>
+                    <pic:cNvPicPr/>
+                  </pic:nvPicPr>
+                  <pic:blipFill>
+                    <a:blip r:embed="rId6"/>
+                    <a:stretch>
+                      <a:fillRect/>
+                    </a:stretch>
+                  </pic:blipFill>
+                  <pic:spPr>
+                    <a:xfrm>
+                      <a:off x="0" y="0"/>
+                      <a:ext cx="3707640" cy="2891183"/>
+                    </a:xfrm>
+                    <a:prstGeom prst="rect">
+                      <a:avLst/>
+                    </a:prstGeom>
+                  </pic:spPr>
+                </pic:pic>
+              </a:graphicData>
+            </a:graphic>
+          </wp:inline>
+        </w:drawing>
+      </w:r>
+    </w:p>
+    <w:p>
+      <w:pPr>
+        <w:pStyle w:val="Chuthich"/>
+        <w:jc w:val="center"/>
+        <w:rPr>
+          <w:rFonts w:ascii="Times  New Roman" w:hAnsi="Times  New Roman"/>
+          <w:sz w:val="20"/>
+          <w:szCs w:val="20"/>
+        </w:rPr>
+      </w:pPr>
+      <w:r>
+        <w:rPr>
+          <w:rFonts w:ascii="Times  New Roman" w:hAnsi="Times  New Roman"/>
+          <w:sz w:val="20"/>
+          <w:szCs w:val="20"/>
+        </w:rPr>
+        <w:t xml:space="preserve">Figure </w:t>
+      </w:r>
+      <w:r>
+        <w:rPr>
+          <w:rFonts w:ascii="Times  New Roman" w:hAnsi="Times  New Roman"/>
+          <w:sz w:val="20"/>
+          <w:szCs w:val="20"/>
+        </w:rPr>
+        <w:fldChar w:fldCharType="begin"/>
+      </w:r>
+      <w:r>
+        <w:rPr>
+          <w:rFonts w:ascii="Times  New Roman" w:hAnsi="Times  New Roman"/>
+          <w:sz w:val="20"/>
+          <w:szCs w:val="20"/>
+        </w:rPr>
+        <w:instrText xml:space="preserve"> SEQ Figure \* ARABIC </w:instrText>
+      </w:r>
+      <w:r>
+        <w:rPr>
+          <w:rFonts w:ascii="Times  New Roman" w:hAnsi="Times  New Roman"/>
+          <w:sz w:val="20"/>
+          <w:szCs w:val="20"/>
+        </w:rPr>
+        <w:fldChar w:fldCharType="separate"/>
+      </w:r>
+      <w:r>
+        <w:rPr>
+          <w:rFonts w:ascii="Times  New Roman" w:hAnsi="Times  New Roman"/>
+          <w:sz w:val="20"/>
+          <w:szCs w:val="20"/>
+        </w:rPr>
+        <w:t>1</w:t>
+      </w:r>
+      <w:r>
+        <w:rPr>
+          <w:rFonts w:ascii="Times  New Roman" w:hAnsi="Times  New Roman"/>
+          <w:sz w:val="20"/>
+          <w:szCs w:val="20"/>
+        </w:rPr>
+        <w:fldChar w:fldCharType="end"/>
+      </w:r>
+      <w:r>
+        <w:rPr>
+          <w:rFonts w:ascii="Times  New Roman" w:hAnsi="Times  New Roman"/>
+          <w:sz w:val="20"/>
+          <w:szCs w:val="20"/>
+        </w:rPr>
+        <w:t xml:space="preserve">. </w:t>
+      </w:r>
+      <w:r>
+        <w:rPr>
+          <w:rFonts w:ascii="Times  New Roman" w:hAnsi="Times  New Roman"/>
+          <w:sz w:val="20"/>
+          <w:szCs w:val="20"/>
+        </w:rPr>
+        <w:t>Room Discovery &amp; Multi-Parameter Filter (RoomListScreen)</w:t>
+      </w:r>
+    </w:p>
+    <w:p>
+      <w:pPr>
+        <w:pStyle w:val="Duudong"/>
+        <w:spacing w:after="80"/>
+        <w:rPr>
+          <w:rFonts w:ascii="Times  New Roman" w:hAnsi="Times  New Roman"/>
+          <w:sz w:val="28"/>
+          <w:szCs w:val="28"/>
+        </w:rPr>
+      </w:pPr>
+      <w:r>
+        <w:rPr>
+          <w:rFonts w:ascii="Times  New Roman" w:hAnsi="Times  New Roman"/>
           <w:b/>
           <w:color w:val="1E3A5F"/>
+          <w:sz w:val="28"/>
+          <w:szCs w:val="28"/>
         </w:rPr>
+        <w:lastRenderedPageBreak/>
         <w:t xml:space="preserve">Interactive Time-Slot Selector &amp; 90s Countdown Modal (RoomDetailScreen): </w:t>
       </w:r>
       <w:r>
         <w:rPr>
+          <w:rFonts w:ascii="Times  New Roman" w:hAnsi="Times  New Roman"/>
           <w:color w:val="334155"/>
+          <w:sz w:val="28"/>
+          <w:szCs w:val="28"/>
         </w:rPr>
         <w:t>Features a 7-day rolling calendar with 4 discrete two-hour slots per day. Selecting an available slot initiates a 90-second soft hold with a synchronized countdown timer, broadcasting HELD_BY_OTHER amber badges across all connected devices.</w:t>
       </w:r>
@@ -1710,18 +2594,165 @@
     <w:p>
       <w:pPr>
         <w:pStyle w:val="Duudong"/>
+        <w:keepNext/>
+        <w:numPr>
+          <w:ilvl w:val="0"/>
+          <w:numId w:val="0"/>
+        </w:numPr>
         <w:spacing w:after="80"/>
+        <w:ind w:left="360"/>
+        <w:jc w:val="center"/>
+        <w:rPr>
+          <w:rFonts w:ascii="Times  New Roman" w:hAnsi="Times  New Roman"/>
+        </w:rPr>
       </w:pPr>
       <w:r>
         <w:rPr>
+          <w:rFonts w:ascii="Times  New Roman" w:hAnsi="Times  New Roman"/>
+          <w:sz w:val="28"/>
+          <w:szCs w:val="28"/>
+        </w:rPr>
+        <w:drawing>
+          <wp:inline distT="0" distB="0" distL="0" distR="0" wp14:anchorId="35FC98AB" wp14:editId="6E83F5A9">
+            <wp:extent cx="4512366" cy="3318424"/>
+            <wp:effectExtent l="0" t="0" r="2540" b="0"/>
+            <wp:docPr id="814610516" name="Hình ảnh 1"/>
+            <wp:cNvGraphicFramePr>
+              <a:graphicFrameLocks xmlns:a="http://schemas.openxmlformats.org/drawingml/2006/main" noChangeAspect="1"/>
+            </wp:cNvGraphicFramePr>
+            <a:graphic xmlns:a="http://schemas.openxmlformats.org/drawingml/2006/main">
+              <a:graphicData uri="http://schemas.openxmlformats.org/drawingml/2006/picture">
+                <pic:pic xmlns:pic="http://schemas.openxmlformats.org/drawingml/2006/picture">
+                  <pic:nvPicPr>
+                    <pic:cNvPr id="814610516" name=""/>
+                    <pic:cNvPicPr/>
+                  </pic:nvPicPr>
+                  <pic:blipFill>
+                    <a:blip r:embed="rId7"/>
+                    <a:stretch>
+                      <a:fillRect/>
+                    </a:stretch>
+                  </pic:blipFill>
+                  <pic:spPr>
+                    <a:xfrm>
+                      <a:off x="0" y="0"/>
+                      <a:ext cx="4521335" cy="3325020"/>
+                    </a:xfrm>
+                    <a:prstGeom prst="rect">
+                      <a:avLst/>
+                    </a:prstGeom>
+                  </pic:spPr>
+                </pic:pic>
+              </a:graphicData>
+            </a:graphic>
+          </wp:inline>
+        </w:drawing>
+      </w:r>
+    </w:p>
+    <w:p>
+      <w:pPr>
+        <w:pStyle w:val="Chuthich"/>
+        <w:jc w:val="center"/>
+        <w:rPr>
+          <w:rFonts w:ascii="Times  New Roman" w:hAnsi="Times  New Roman"/>
+          <w:sz w:val="20"/>
+          <w:szCs w:val="20"/>
+          <w:lang w:val="vi-VN"/>
+        </w:rPr>
+      </w:pPr>
+      <w:r>
+        <w:rPr>
+          <w:rFonts w:ascii="Times  New Roman" w:hAnsi="Times  New Roman"/>
+          <w:sz w:val="20"/>
+          <w:szCs w:val="20"/>
+        </w:rPr>
+        <w:t xml:space="preserve">Figure </w:t>
+      </w:r>
+      <w:r>
+        <w:rPr>
+          <w:rFonts w:ascii="Times  New Roman" w:hAnsi="Times  New Roman"/>
+          <w:sz w:val="20"/>
+          <w:szCs w:val="20"/>
+        </w:rPr>
+        <w:fldChar w:fldCharType="begin"/>
+      </w:r>
+      <w:r>
+        <w:rPr>
+          <w:rFonts w:ascii="Times  New Roman" w:hAnsi="Times  New Roman"/>
+          <w:sz w:val="20"/>
+          <w:szCs w:val="20"/>
+        </w:rPr>
+        <w:instrText xml:space="preserve"> SEQ Figure \* ARABIC </w:instrText>
+      </w:r>
+      <w:r>
+        <w:rPr>
+          <w:rFonts w:ascii="Times  New Roman" w:hAnsi="Times  New Roman"/>
+          <w:sz w:val="20"/>
+          <w:szCs w:val="20"/>
+        </w:rPr>
+        <w:fldChar w:fldCharType="separate"/>
+      </w:r>
+      <w:r>
+        <w:rPr>
+          <w:rFonts w:ascii="Times  New Roman" w:hAnsi="Times  New Roman"/>
+          <w:noProof/>
+          <w:sz w:val="20"/>
+          <w:szCs w:val="20"/>
+        </w:rPr>
+        <w:t>2</w:t>
+      </w:r>
+      <w:r>
+        <w:rPr>
+          <w:rFonts w:ascii="Times  New Roman" w:hAnsi="Times  New Roman"/>
+          <w:sz w:val="20"/>
+          <w:szCs w:val="20"/>
+        </w:rPr>
+        <w:fldChar w:fldCharType="end"/>
+      </w:r>
+      <w:r>
+        <w:rPr>
+          <w:rFonts w:ascii="Times  New Roman" w:hAnsi="Times  New Roman"/>
+          <w:sz w:val="20"/>
+          <w:szCs w:val="20"/>
+          <w:lang w:val="vi-VN"/>
+        </w:rPr>
+        <w:t xml:space="preserve">. </w:t>
+      </w:r>
+      <w:r>
+        <w:rPr>
+          <w:rFonts w:ascii="Times  New Roman" w:hAnsi="Times  New Roman"/>
+          <w:sz w:val="20"/>
+          <w:szCs w:val="20"/>
+        </w:rPr>
+        <w:t>Interactive Time-Slot Selector &amp; 90s Countdown Modal (RoomDetailScreen)</w:t>
+      </w:r>
+    </w:p>
+    <w:p>
+      <w:pPr>
+        <w:pStyle w:val="Duudong"/>
+        <w:spacing w:after="80"/>
+        <w:rPr>
+          <w:rFonts w:ascii="Times  New Roman" w:hAnsi="Times  New Roman"/>
+          <w:sz w:val="28"/>
+          <w:szCs w:val="28"/>
+        </w:rPr>
+      </w:pPr>
+      <w:r>
+        <w:rPr>
+          <w:rFonts w:ascii="Times  New Roman" w:hAnsi="Times  New Roman"/>
           <w:b/>
           <w:color w:val="1E3A5F"/>
+          <w:sz w:val="28"/>
+          <w:szCs w:val="28"/>
         </w:rPr>
         <w:t xml:space="preserve">Personal Reservations &amp; Offline Synchronization (MyBookingsScreen): </w:t>
       </w:r>
       <w:r>
         <w:rPr>
+          <w:rFonts w:ascii="Times  New Roman" w:hAnsi="Times  New Roman"/>
           <w:color w:val="334155"/>
+          <w:sz w:val="28"/>
+          <w:szCs w:val="28"/>
         </w:rPr>
         <w:t>Segmented tabs for 'All', 'Confirmed', 'Pending Sync', 'Conflicted', and 'Cancelled'. Displays local outbox queue status during offline mode and automatically resolves conflicts with optimistic feedback.</w:t>
       </w:r>
@@ -1729,29 +2760,311 @@
     <w:p>
       <w:pPr>
         <w:pStyle w:val="Duudong"/>
+        <w:keepNext/>
+        <w:numPr>
+          <w:ilvl w:val="0"/>
+          <w:numId w:val="0"/>
+        </w:numPr>
         <w:spacing w:after="80"/>
+        <w:ind w:left="360"/>
+        <w:jc w:val="center"/>
+        <w:rPr>
+          <w:rFonts w:ascii="Times  New Roman" w:hAnsi="Times  New Roman"/>
+        </w:rPr>
       </w:pPr>
       <w:r>
         <w:rPr>
+          <w:rFonts w:ascii="Times  New Roman" w:hAnsi="Times  New Roman"/>
+          <w:sz w:val="28"/>
+          <w:szCs w:val="28"/>
+        </w:rPr>
+        <w:drawing>
+          <wp:inline distT="0" distB="0" distL="0" distR="0" wp14:anchorId="0FB4403E" wp14:editId="1DF46D2C">
+            <wp:extent cx="4630255" cy="2604052"/>
+            <wp:effectExtent l="0" t="0" r="0" b="6350"/>
+            <wp:docPr id="1825360206" name="Hình ảnh 1"/>
+            <wp:cNvGraphicFramePr>
+              <a:graphicFrameLocks xmlns:a="http://schemas.openxmlformats.org/drawingml/2006/main" noChangeAspect="1"/>
+            </wp:cNvGraphicFramePr>
+            <a:graphic xmlns:a="http://schemas.openxmlformats.org/drawingml/2006/main">
+              <a:graphicData uri="http://schemas.openxmlformats.org/drawingml/2006/picture">
+                <pic:pic xmlns:pic="http://schemas.openxmlformats.org/drawingml/2006/picture">
+                  <pic:nvPicPr>
+                    <pic:cNvPr id="1825360206" name=""/>
+                    <pic:cNvPicPr/>
+                  </pic:nvPicPr>
+                  <pic:blipFill>
+                    <a:blip r:embed="rId8"/>
+                    <a:stretch>
+                      <a:fillRect/>
+                    </a:stretch>
+                  </pic:blipFill>
+                  <pic:spPr>
+                    <a:xfrm>
+                      <a:off x="0" y="0"/>
+                      <a:ext cx="4636994" cy="2607842"/>
+                    </a:xfrm>
+                    <a:prstGeom prst="rect">
+                      <a:avLst/>
+                    </a:prstGeom>
+                  </pic:spPr>
+                </pic:pic>
+              </a:graphicData>
+            </a:graphic>
+          </wp:inline>
+        </w:drawing>
+      </w:r>
+    </w:p>
+    <w:p>
+      <w:pPr>
+        <w:pStyle w:val="Chuthich"/>
+        <w:jc w:val="center"/>
+        <w:rPr>
+          <w:rFonts w:ascii="Times  New Roman" w:hAnsi="Times  New Roman"/>
+          <w:sz w:val="20"/>
+          <w:szCs w:val="20"/>
+        </w:rPr>
+      </w:pPr>
+      <w:r>
+        <w:rPr>
+          <w:rFonts w:ascii="Times  New Roman" w:hAnsi="Times  New Roman"/>
+          <w:sz w:val="20"/>
+          <w:szCs w:val="20"/>
+        </w:rPr>
+        <w:t xml:space="preserve">Figure </w:t>
+      </w:r>
+      <w:r>
+        <w:rPr>
+          <w:rFonts w:ascii="Times  New Roman" w:hAnsi="Times  New Roman"/>
+          <w:sz w:val="20"/>
+          <w:szCs w:val="20"/>
+        </w:rPr>
+        <w:fldChar w:fldCharType="begin"/>
+      </w:r>
+      <w:r>
+        <w:rPr>
+          <w:rFonts w:ascii="Times  New Roman" w:hAnsi="Times  New Roman"/>
+          <w:sz w:val="20"/>
+          <w:szCs w:val="20"/>
+        </w:rPr>
+        <w:instrText xml:space="preserve"> SEQ Figure \* ARABIC </w:instrText>
+      </w:r>
+      <w:r>
+        <w:rPr>
+          <w:rFonts w:ascii="Times  New Roman" w:hAnsi="Times  New Roman"/>
+          <w:sz w:val="20"/>
+          <w:szCs w:val="20"/>
+        </w:rPr>
+        <w:fldChar w:fldCharType="separate"/>
+      </w:r>
+      <w:r>
+        <w:rPr>
+          <w:rFonts w:ascii="Times  New Roman" w:hAnsi="Times  New Roman"/>
+          <w:sz w:val="20"/>
+          <w:szCs w:val="20"/>
+        </w:rPr>
+        <w:t>3</w:t>
+      </w:r>
+      <w:r>
+        <w:rPr>
+          <w:rFonts w:ascii="Times  New Roman" w:hAnsi="Times  New Roman"/>
+          <w:sz w:val="20"/>
+          <w:szCs w:val="20"/>
+        </w:rPr>
+        <w:fldChar w:fldCharType="end"/>
+      </w:r>
+      <w:r>
+        <w:rPr>
+          <w:rFonts w:ascii="Times  New Roman" w:hAnsi="Times  New Roman"/>
+          <w:sz w:val="20"/>
+          <w:szCs w:val="20"/>
+        </w:rPr>
+        <w:t xml:space="preserve">. </w:t>
+      </w:r>
+      <w:r>
+        <w:rPr>
+          <w:rFonts w:ascii="Times  New Roman" w:hAnsi="Times  New Roman"/>
+          <w:sz w:val="20"/>
+          <w:szCs w:val="20"/>
+        </w:rPr>
+        <w:t>Personal Reservations &amp; Offline Synchronization (MyBookingsScreen)</w:t>
+      </w:r>
+    </w:p>
+    <w:p>
+      <w:pPr>
+        <w:pStyle w:val="Duudong"/>
+        <w:spacing w:after="80"/>
+        <w:rPr>
+          <w:rFonts w:ascii="Times  New Roman" w:hAnsi="Times  New Roman"/>
+          <w:sz w:val="28"/>
+          <w:szCs w:val="28"/>
+        </w:rPr>
+      </w:pPr>
+      <w:r>
+        <w:rPr>
+          <w:rFonts w:ascii="Times  New Roman" w:hAnsi="Times  New Roman"/>
           <w:b/>
           <w:color w:val="1E3A5F"/>
+          <w:sz w:val="28"/>
+          <w:szCs w:val="28"/>
         </w:rPr>
+        <w:lastRenderedPageBreak/>
         <w:t xml:space="preserve">Digital QR Booking Pass (Check-in Modal): </w:t>
       </w:r>
       <w:r>
         <w:rPr>
+          <w:rFonts w:ascii="Times  New Roman" w:hAnsi="Times  New Roman"/>
           <w:color w:val="334155"/>
+          <w:sz w:val="28"/>
+          <w:szCs w:val="28"/>
         </w:rPr>
         <w:t>Generates a high-contrast, cryptographically clean QR code encoding the unique booking token for campus security check-in.</w:t>
       </w:r>
     </w:p>
     <w:p>
       <w:pPr>
-        <w:pStyle w:val="u1"/>
-        <w:spacing w:before="320" w:after="120"/>
+        <w:pStyle w:val="Duudong"/>
+        <w:keepNext/>
+        <w:numPr>
+          <w:ilvl w:val="0"/>
+          <w:numId w:val="0"/>
+        </w:numPr>
+        <w:spacing w:after="80"/>
+        <w:ind w:left="360"/>
+        <w:jc w:val="center"/>
+        <w:rPr>
+          <w:rFonts w:ascii="Times  New Roman" w:hAnsi="Times  New Roman"/>
+        </w:rPr>
       </w:pPr>
       <w:r>
         <w:rPr>
+          <w:rFonts w:ascii="Times  New Roman" w:hAnsi="Times  New Roman"/>
+          <w:sz w:val="28"/>
+          <w:szCs w:val="28"/>
+        </w:rPr>
+        <w:drawing>
+          <wp:inline distT="0" distB="0" distL="0" distR="0" wp14:anchorId="684DED1D" wp14:editId="5C1B0A3C">
+            <wp:extent cx="4530256" cy="3239480"/>
+            <wp:effectExtent l="0" t="0" r="3810" b="0"/>
+            <wp:docPr id="1560806209" name="Hình ảnh 1"/>
+            <wp:cNvGraphicFramePr>
+              <a:graphicFrameLocks xmlns:a="http://schemas.openxmlformats.org/drawingml/2006/main" noChangeAspect="1"/>
+            </wp:cNvGraphicFramePr>
+            <a:graphic xmlns:a="http://schemas.openxmlformats.org/drawingml/2006/main">
+              <a:graphicData uri="http://schemas.openxmlformats.org/drawingml/2006/picture">
+                <pic:pic xmlns:pic="http://schemas.openxmlformats.org/drawingml/2006/picture">
+                  <pic:nvPicPr>
+                    <pic:cNvPr id="1560806209" name=""/>
+                    <pic:cNvPicPr/>
+                  </pic:nvPicPr>
+                  <pic:blipFill>
+                    <a:blip r:embed="rId9"/>
+                    <a:stretch>
+                      <a:fillRect/>
+                    </a:stretch>
+                  </pic:blipFill>
+                  <pic:spPr>
+                    <a:xfrm>
+                      <a:off x="0" y="0"/>
+                      <a:ext cx="4533649" cy="3241906"/>
+                    </a:xfrm>
+                    <a:prstGeom prst="rect">
+                      <a:avLst/>
+                    </a:prstGeom>
+                  </pic:spPr>
+                </pic:pic>
+              </a:graphicData>
+            </a:graphic>
+          </wp:inline>
+        </w:drawing>
+      </w:r>
+    </w:p>
+    <w:p>
+      <w:pPr>
+        <w:pStyle w:val="Chuthich"/>
+        <w:jc w:val="center"/>
+        <w:rPr>
+          <w:rFonts w:ascii="Times  New Roman" w:hAnsi="Times  New Roman"/>
+          <w:sz w:val="20"/>
+          <w:szCs w:val="20"/>
+        </w:rPr>
+      </w:pPr>
+      <w:r>
+        <w:rPr>
+          <w:rFonts w:ascii="Times  New Roman" w:hAnsi="Times  New Roman"/>
+          <w:sz w:val="20"/>
+          <w:szCs w:val="20"/>
+        </w:rPr>
+        <w:t xml:space="preserve">Figure </w:t>
+      </w:r>
+      <w:r>
+        <w:rPr>
+          <w:rFonts w:ascii="Times  New Roman" w:hAnsi="Times  New Roman"/>
+          <w:sz w:val="20"/>
+          <w:szCs w:val="20"/>
+        </w:rPr>
+        <w:fldChar w:fldCharType="begin"/>
+      </w:r>
+      <w:r>
+        <w:rPr>
+          <w:rFonts w:ascii="Times  New Roman" w:hAnsi="Times  New Roman"/>
+          <w:sz w:val="20"/>
+          <w:szCs w:val="20"/>
+        </w:rPr>
+        <w:instrText xml:space="preserve"> SEQ Figure \* ARABIC </w:instrText>
+      </w:r>
+      <w:r>
+        <w:rPr>
+          <w:rFonts w:ascii="Times  New Roman" w:hAnsi="Times  New Roman"/>
+          <w:sz w:val="20"/>
+          <w:szCs w:val="20"/>
+        </w:rPr>
+        <w:fldChar w:fldCharType="separate"/>
+      </w:r>
+      <w:r>
+        <w:rPr>
+          <w:rFonts w:ascii="Times  New Roman" w:hAnsi="Times  New Roman"/>
+          <w:sz w:val="20"/>
+          <w:szCs w:val="20"/>
+        </w:rPr>
+        <w:t>4</w:t>
+      </w:r>
+      <w:r>
+        <w:rPr>
+          <w:rFonts w:ascii="Times  New Roman" w:hAnsi="Times  New Roman"/>
+          <w:sz w:val="20"/>
+          <w:szCs w:val="20"/>
+        </w:rPr>
+        <w:fldChar w:fldCharType="end"/>
+      </w:r>
+      <w:r>
+        <w:rPr>
+          <w:rFonts w:ascii="Times  New Roman" w:hAnsi="Times  New Roman"/>
+          <w:sz w:val="20"/>
+          <w:szCs w:val="20"/>
+        </w:rPr>
+        <w:t xml:space="preserve">. </w:t>
+      </w:r>
+      <w:r>
+        <w:rPr>
+          <w:rFonts w:ascii="Times  New Roman" w:hAnsi="Times  New Roman"/>
+          <w:sz w:val="20"/>
+          <w:szCs w:val="20"/>
+        </w:rPr>
+        <w:t>Digital QR Booking Pass (Check-in Modal)</w:t>
+      </w:r>
+    </w:p>
+    <w:p>
+      <w:pPr>
+        <w:pStyle w:val="u1"/>
+        <w:spacing w:before="320" w:after="120"/>
+        <w:rPr>
+          <w:rFonts w:ascii="Times  New Roman" w:hAnsi="Times  New Roman"/>
+        </w:rPr>
+      </w:pPr>
+      <w:r>
+        <w:rPr>
+          <w:rFonts w:ascii="Times  New Roman" w:hAnsi="Times  New Roman"/>
           <w:color w:val="1E3A5F"/>
         </w:rPr>
         <w:t>5. TECHNICAL CHALLENGES &amp; RESOLUTIONS</w:t>
@@ -1760,11 +3073,19 @@
     <w:p>
       <w:pPr>
         <w:spacing w:before="80" w:after="40"/>
+        <w:rPr>
+          <w:rFonts w:ascii="Times  New Roman" w:hAnsi="Times  New Roman"/>
+          <w:sz w:val="28"/>
+          <w:szCs w:val="28"/>
+        </w:rPr>
       </w:pPr>
       <w:r>
         <w:rPr>
+          <w:rFonts w:ascii="Times  New Roman" w:hAnsi="Times  New Roman"/>
           <w:b/>
           <w:color w:val="0284C7"/>
+          <w:sz w:val="28"/>
+          <w:szCs w:val="28"/>
         </w:rPr>
         <w:t>Challenge 1: Distributed Race Conditions &amp; The 90-Second Soft Hold</w:t>
       </w:r>
@@ -1772,16 +3093,27 @@
     <w:p>
       <w:pPr>
         <w:spacing w:after="120"/>
+        <w:rPr>
+          <w:rFonts w:ascii="Times  New Roman" w:hAnsi="Times  New Roman"/>
+          <w:sz w:val="28"/>
+          <w:szCs w:val="28"/>
+        </w:rPr>
       </w:pPr>
       <w:r>
         <w:rPr>
+          <w:rFonts w:ascii="Times  New Roman" w:hAnsi="Times  New Roman"/>
           <w:color w:val="334155"/>
+          <w:sz w:val="28"/>
+          <w:szCs w:val="28"/>
         </w:rPr>
         <w:t>Problem: In high-traffic scenarios (e.g., final exam week), multiple students may attempt to reserve the same room slot simultaneously. Naive client-side checks allow double-booking (Time-of-Check to Time-of-Use vulnerability). Furthermore, if a user dismissed the hold modal during network flight, unreleased holds caused phantom 90-second locks.</w:t>
       </w:r>
       <w:r>
         <w:rPr>
+          <w:rFonts w:ascii="Times  New Roman" w:hAnsi="Times  New Roman"/>
           <w:color w:val="334155"/>
+          <w:sz w:val="28"/>
+          <w:szCs w:val="28"/>
         </w:rPr>
         <w:br/>
         <w:t>Resolution: (1) Implemented a dual-barrier locking mechanism: PostgreSQL transaction-level advisory locks (pg_advisory_xact_lock) combined with a partial unique constraint idx_bookings_active_slot (room_id, booking_date, slot_index) WHERE status = 'CONFIRMED'. (2) Implemented isCancelledRef inside ConfirmBookingModal: If the user cancels the modal before the server responds to initiateHold, the in-flight result is immediately rolled back via a background releaseHold call, ensuring slots return to AVAILABLE without delay.</w:t>
@@ -1790,11 +3122,19 @@
     <w:p>
       <w:pPr>
         <w:spacing w:before="80" w:after="40"/>
+        <w:rPr>
+          <w:rFonts w:ascii="Times  New Roman" w:hAnsi="Times  New Roman"/>
+          <w:sz w:val="28"/>
+          <w:szCs w:val="28"/>
+        </w:rPr>
       </w:pPr>
       <w:r>
         <w:rPr>
+          <w:rFonts w:ascii="Times  New Roman" w:hAnsi="Times  New Roman"/>
           <w:b/>
           <w:color w:val="0284C7"/>
+          <w:sz w:val="28"/>
+          <w:szCs w:val="28"/>
         </w:rPr>
         <w:t>Challenge 2: Offline Outbox Causality &amp; Conflict Reconciliation</w:t>
       </w:r>
@@ -1802,16 +3142,37 @@
     <w:p>
       <w:pPr>
         <w:spacing w:after="120"/>
+        <w:rPr>
+          <w:rFonts w:ascii="Times  New Roman" w:hAnsi="Times  New Roman"/>
+          <w:sz w:val="28"/>
+          <w:szCs w:val="28"/>
+        </w:rPr>
       </w:pPr>
       <w:r>
         <w:rPr>
+          <w:rFonts w:ascii="Times  New Roman" w:hAnsi="Times  New Roman"/>
           <w:color w:val="334155"/>
+          <w:sz w:val="28"/>
+          <w:szCs w:val="28"/>
         </w:rPr>
-        <w:t>Problem: When a student books while walking through dead zones (offline), naive approaches either block the user or optimistically mark the booking as confirmed, causing severe confusion if another student booked the slot online.</w:t>
+        <w:t xml:space="preserve">Problem: When a student books while walking through dead zones (offline), naive approaches either block the user or optimistically mark the booking as confirmed, </w:t>
       </w:r>
       <w:r>
         <w:rPr>
+          <w:rFonts w:ascii="Times  New Roman" w:hAnsi="Times  New Roman"/>
           <w:color w:val="334155"/>
+          <w:sz w:val="28"/>
+          <w:szCs w:val="28"/>
+        </w:rPr>
+        <w:lastRenderedPageBreak/>
+        <w:t>causing severe confusion if another student booked the slot online.</w:t>
+      </w:r>
+      <w:r>
+        <w:rPr>
+          <w:rFonts w:ascii="Times  New Roman" w:hAnsi="Times  New Roman"/>
+          <w:color w:val="334155"/>
+          <w:sz w:val="28"/>
+          <w:szCs w:val="28"/>
         </w:rPr>
         <w:br/>
         <w:t>Resolution: Built an explicit Offline Outbox Engine: Offline bookings are created with state PENDING_SYNC and queued in FIFO order. When NetInfo detects reconnection, the engine sequentially flushes outbox items against the server. If the slot was taken while offline, the booking is transitioned deterministically to CONFLICTED with human-readable error diagnostics, avoiding silent data corruption.</w:t>
@@ -3203,7 +4564,6 @@
     <w:basedOn w:val="Binhthng"/>
     <w:next w:val="Binhthng"/>
     <w:uiPriority w:val="35"/>
-    <w:semiHidden/>
     <w:unhideWhenUsed/>
     <w:qFormat/>
     <w:rsid w:val="00FC693F"/>

</xml_diff>

<commit_message>
docs: align technical challenges with VKU rubric and finalize report documentation
</commit_message>
<xml_diff>
--- a/docs/MINI_PROJECT_2_REPORT.docx
+++ b/docs/MINI_PROJECT_2_REPORT.docx
@@ -8,8 +8,8 @@
         <w:jc w:val="center"/>
         <w:rPr>
           <w:rFonts w:ascii="Times  New Roman" w:hAnsi="Times  New Roman"/>
-          <w:sz w:val="40"/>
-          <w:szCs w:val="40"/>
+          <w:sz w:val="36"/>
+          <w:szCs w:val="36"/>
         </w:rPr>
       </w:pPr>
       <w:r>
@@ -17,8 +17,8 @@
           <w:rFonts w:ascii="Times  New Roman" w:hAnsi="Times  New Roman"/>
           <w:b/>
           <w:color w:val="1E3A5F"/>
-          <w:sz w:val="40"/>
-          <w:szCs w:val="40"/>
+          <w:sz w:val="36"/>
+          <w:szCs w:val="36"/>
         </w:rPr>
         <w:t>MINI-PROJECT SHORT TECHNICAL REPORT</w:t>
       </w:r>
@@ -88,7 +88,6 @@
           <w:rFonts w:ascii="Times  New Roman" w:hAnsi="Times  New Roman"/>
           <w:sz w:val="28"/>
           <w:szCs w:val="28"/>
-          <w:lang w:val="vi-VN"/>
         </w:rPr>
       </w:pPr>
       <w:r>
@@ -108,25 +107,7 @@
           <w:sz w:val="28"/>
           <w:szCs w:val="28"/>
         </w:rPr>
-        <w:t xml:space="preserve">Lê </w:t>
-      </w:r>
-      <w:r>
-        <w:rPr>
-          <w:rFonts w:ascii="Times  New Roman" w:hAnsi="Times  New Roman"/>
-          <w:color w:val="334155"/>
-          <w:sz w:val="28"/>
-          <w:szCs w:val="28"/>
-        </w:rPr>
-        <w:t>Cả</w:t>
-      </w:r>
-      <w:r>
-        <w:rPr>
-          <w:rFonts w:ascii="Times  New Roman" w:hAnsi="Times  New Roman"/>
-          <w:color w:val="334155"/>
-          <w:sz w:val="28"/>
-          <w:szCs w:val="28"/>
-        </w:rPr>
-        <w:t>m</w:t>
+        <w:t>Lê Cảm (CAMLC25)</w:t>
       </w:r>
     </w:p>
     <w:p>
@@ -202,25 +183,7 @@
           <w:sz w:val="28"/>
           <w:szCs w:val="28"/>
         </w:rPr>
-        <w:t xml:space="preserve">Lê </w:t>
-      </w:r>
-      <w:r>
-        <w:rPr>
-          <w:rFonts w:ascii="Times  New Roman" w:hAnsi="Times  New Roman"/>
-          <w:color w:val="334155"/>
-          <w:sz w:val="28"/>
-          <w:szCs w:val="28"/>
-        </w:rPr>
-        <w:t>Cả</w:t>
-      </w:r>
-      <w:r>
-        <w:rPr>
-          <w:rFonts w:ascii="Times  New Roman" w:hAnsi="Times  New Roman"/>
-          <w:color w:val="334155"/>
-          <w:sz w:val="28"/>
-          <w:szCs w:val="28"/>
-        </w:rPr>
-        <w:t>m — Student ID: 21IT001 — Role: Fullstack Mobile Architecture &amp; Concurrency Engine — Contribution: 100%</w:t>
+        <w:t>Lê Cảm — Student ID: 21IT001 — Role: Fullstack Mobile Architecture &amp; Concurrency Engine — Contribution: 100%</w:t>
       </w:r>
     </w:p>
     <w:p>
@@ -637,7 +600,7 @@
                 <w:sz w:val="28"/>
                 <w:szCs w:val="28"/>
               </w:rPr>
-              <w:t>Custom hook useResponsiveLayout adapts across Mobile (1 col), Tablet (2 cols), Desktop (3 cols). Native safe area insets via react-native-safe-area-context.</w:t>
+              <w:t>Custom hook useResponsiveLayout adapts across Mobile (1 col) and Desktop/Tablet (2 cols) with Math.min(width, 1140) width clamping and flex: 1 columns preventing offscreen clipping. Full dynamic inset handling via react-native-safe-area-context.</w:t>
             </w:r>
           </w:p>
         </w:tc>
@@ -812,6 +775,7 @@
                 <w:sz w:val="28"/>
                 <w:szCs w:val="28"/>
               </w:rPr>
+              <w:lastRenderedPageBreak/>
               <w:t>3</w:t>
             </w:r>
           </w:p>
@@ -915,17 +879,7 @@
                 <w:sz w:val="28"/>
                 <w:szCs w:val="28"/>
               </w:rPr>
-              <w:t xml:space="preserve">Zustand store with persist middleware storing in @react-native-async-storage/async-storage under </w:t>
-            </w:r>
-            <w:r>
-              <w:rPr>
-                <w:rFonts w:ascii="Times  New Roman" w:hAnsi="Times  New Roman"/>
-                <w:color w:val="334155"/>
-                <w:sz w:val="28"/>
-                <w:szCs w:val="28"/>
-              </w:rPr>
-              <w:lastRenderedPageBreak/>
-              <w:t>key 'vku-booking-storage'.</w:t>
+              <w:t>Zustand store with persist middleware storing in @react-native-async-storage/async-storage under key 'vku-booking-storage'.</w:t>
             </w:r>
           </w:p>
         </w:tc>
@@ -961,7 +915,6 @@
                 <w:sz w:val="28"/>
                 <w:szCs w:val="28"/>
               </w:rPr>
-              <w:lastRenderedPageBreak/>
               <w:t>4</w:t>
             </w:r>
           </w:p>
@@ -1760,7 +1713,17 @@
                 <w:sz w:val="28"/>
                 <w:szCs w:val="28"/>
               </w:rPr>
-              <w:t>Offline booking requests queued in an outbox (PENDING_SYNC) and flushed sequentially upon reconnection with deterministic conflict handling.</w:t>
+              <w:t xml:space="preserve">Offline booking requests queued in an outbox (PENDING_SYNC) and flushed sequentially upon </w:t>
+            </w:r>
+            <w:r>
+              <w:rPr>
+                <w:rFonts w:ascii="Times  New Roman" w:hAnsi="Times  New Roman"/>
+                <w:color w:val="334155"/>
+                <w:sz w:val="28"/>
+                <w:szCs w:val="28"/>
+              </w:rPr>
+              <w:lastRenderedPageBreak/>
+              <w:t>reconnection with deterministic conflict handling.</w:t>
             </w:r>
           </w:p>
         </w:tc>
@@ -2044,6 +2007,145 @@
           </w:p>
         </w:tc>
       </w:tr>
+      <w:tr>
+        <w:trPr>
+          <w:jc w:val="center"/>
+        </w:trPr>
+        <w:tc>
+          <w:tcPr>
+            <w:tcW w:w="576" w:type="dxa"/>
+            <w:shd w:val="clear" w:color="auto" w:fill="F8FAFC"/>
+            <w:tcMar>
+              <w:top w:w="80" w:type="dxa"/>
+              <w:left w:w="120" w:type="dxa"/>
+              <w:bottom w:w="80" w:type="dxa"/>
+              <w:right w:w="120" w:type="dxa"/>
+            </w:tcMar>
+          </w:tcPr>
+          <w:p>
+            <w:pPr>
+              <w:jc w:val="center"/>
+              <w:rPr>
+                <w:rFonts w:ascii="Times  New Roman" w:hAnsi="Times  New Roman"/>
+                <w:sz w:val="28"/>
+                <w:szCs w:val="28"/>
+              </w:rPr>
+            </w:pPr>
+            <w:r>
+              <w:rPr>
+                <w:rFonts w:ascii="Times  New Roman" w:hAnsi="Times  New Roman"/>
+                <w:color w:val="334155"/>
+                <w:sz w:val="28"/>
+                <w:szCs w:val="28"/>
+              </w:rPr>
+              <w:t>12</w:t>
+            </w:r>
+          </w:p>
+        </w:tc>
+        <w:tc>
+          <w:tcPr>
+            <w:tcW w:w="3168" w:type="dxa"/>
+            <w:shd w:val="clear" w:color="auto" w:fill="F8FAFC"/>
+            <w:tcMar>
+              <w:top w:w="80" w:type="dxa"/>
+              <w:left w:w="120" w:type="dxa"/>
+              <w:bottom w:w="80" w:type="dxa"/>
+              <w:right w:w="120" w:type="dxa"/>
+            </w:tcMar>
+          </w:tcPr>
+          <w:p>
+            <w:pPr>
+              <w:rPr>
+                <w:rFonts w:ascii="Times  New Roman" w:hAnsi="Times  New Roman"/>
+                <w:sz w:val="28"/>
+                <w:szCs w:val="28"/>
+              </w:rPr>
+            </w:pPr>
+            <w:r>
+              <w:rPr>
+                <w:rFonts w:ascii="Times  New Roman" w:hAnsi="Times  New Roman"/>
+                <w:b/>
+                <w:color w:val="1E3A5F"/>
+                <w:sz w:val="28"/>
+                <w:szCs w:val="28"/>
+              </w:rPr>
+              <w:t>Student Auth, Email Verification &amp; Profile Sync</w:t>
+            </w:r>
+          </w:p>
+        </w:tc>
+        <w:tc>
+          <w:tcPr>
+            <w:tcW w:w="1584" w:type="dxa"/>
+            <w:shd w:val="clear" w:color="auto" w:fill="F8FAFC"/>
+            <w:tcMar>
+              <w:top w:w="80" w:type="dxa"/>
+              <w:left w:w="120" w:type="dxa"/>
+              <w:bottom w:w="80" w:type="dxa"/>
+              <w:right w:w="120" w:type="dxa"/>
+            </w:tcMar>
+          </w:tcPr>
+          <w:p>
+            <w:pPr>
+              <w:jc w:val="center"/>
+              <w:rPr>
+                <w:rFonts w:ascii="Times  New Roman" w:hAnsi="Times  New Roman"/>
+                <w:sz w:val="28"/>
+                <w:szCs w:val="28"/>
+              </w:rPr>
+            </w:pPr>
+            <w:r>
+              <w:rPr>
+                <w:rFonts w:ascii="Segoe UI Emoji" w:hAnsi="Segoe UI Emoji" w:cs="Segoe UI Emoji"/>
+                <w:b/>
+                <w:color w:val="10B981"/>
+                <w:sz w:val="28"/>
+                <w:szCs w:val="28"/>
+              </w:rPr>
+              <w:t>✅</w:t>
+            </w:r>
+            <w:r>
+              <w:rPr>
+                <w:rFonts w:ascii="Times  New Roman" w:hAnsi="Times  New Roman"/>
+                <w:b/>
+                <w:color w:val="10B981"/>
+                <w:sz w:val="28"/>
+                <w:szCs w:val="28"/>
+              </w:rPr>
+              <w:t xml:space="preserve"> Complete</w:t>
+            </w:r>
+          </w:p>
+        </w:tc>
+        <w:tc>
+          <w:tcPr>
+            <w:tcW w:w="4464" w:type="dxa"/>
+            <w:shd w:val="clear" w:color="auto" w:fill="F8FAFC"/>
+            <w:tcMar>
+              <w:top w:w="80" w:type="dxa"/>
+              <w:left w:w="120" w:type="dxa"/>
+              <w:bottom w:w="80" w:type="dxa"/>
+              <w:right w:w="120" w:type="dxa"/>
+            </w:tcMar>
+          </w:tcPr>
+          <w:p>
+            <w:pPr>
+              <w:rPr>
+                <w:rFonts w:ascii="Times  New Roman" w:hAnsi="Times  New Roman"/>
+                <w:sz w:val="28"/>
+                <w:szCs w:val="28"/>
+              </w:rPr>
+            </w:pPr>
+            <w:r>
+              <w:rPr>
+                <w:rFonts w:ascii="Times  New Roman" w:hAnsi="Times  New Roman"/>
+                <w:color w:val="334155"/>
+                <w:sz w:val="28"/>
+                <w:szCs w:val="28"/>
+              </w:rPr>
+              <w:t>Full authentication with real email/password via Supabase Auth (auth.users), custom Gmail SMTP Relay bypassing free-tier rate limits, mandatory email confirmation with 1-tap deep link auto-login (#access_token), and PostgreSQL trigger on auth.users syncing to public.students.</w:t>
+            </w:r>
+          </w:p>
+        </w:tc>
+      </w:tr>
     </w:tbl>
     <w:p>
       <w:pPr>
@@ -2167,6 +2269,15 @@
           <w:szCs w:val="28"/>
         </w:rPr>
         <w:br/>
+      </w:r>
+      <w:r>
+        <w:rPr>
+          <w:rFonts w:ascii="Times  New Roman" w:hAnsi="Times  New Roman"/>
+          <w:color w:val="1E293B"/>
+          <w:sz w:val="28"/>
+          <w:szCs w:val="28"/>
+        </w:rPr>
+        <w:lastRenderedPageBreak/>
         <w:t>│   ├── hooks/                  # Custom hooks (useRooms, useResponsiveLayout, useRoomAvailability)</w:t>
       </w:r>
       <w:r>
@@ -2207,7 +2318,7 @@
           <w:szCs w:val="28"/>
         </w:rPr>
         <w:br/>
-        <w:t>│   ├── screens/                # Core screens (RoomListScreen, RoomDetailScreen, MyBookingsScreen, ProfileScreen)</w:t>
+        <w:t>│   ├── screens/                # Core screens (RoomListScreen, RoomDetailScreen, MyBookingsScreen, ProfileScreen, LoginScreen, RegisterScreen)</w:t>
       </w:r>
       <w:r>
         <w:rPr>
@@ -2217,7 +2328,7 @@
           <w:szCs w:val="28"/>
         </w:rPr>
         <w:br/>
-        <w:t>│   ├── services/               # Abstraction layer (Supabase, Mock, Outbox Sync, Notifications)</w:t>
+        <w:t>│   ├── services/               # Abstraction layer (Supabase, Mock, Outbox Sync, Notifications, Auth)</w:t>
       </w:r>
       <w:r>
         <w:rPr>
@@ -2247,15 +2358,6 @@
           <w:szCs w:val="28"/>
         </w:rPr>
         <w:br/>
-      </w:r>
-      <w:r>
-        <w:rPr>
-          <w:rFonts w:ascii="Times  New Roman" w:hAnsi="Times  New Roman"/>
-          <w:color w:val="1E293B"/>
-          <w:sz w:val="28"/>
-          <w:szCs w:val="28"/>
-        </w:rPr>
-        <w:lastRenderedPageBreak/>
         <w:t>│   └── types/                  # Strict TypeScript domain interfaces</w:t>
       </w:r>
       <w:r>
@@ -2323,6 +2425,7 @@
       <w:pPr>
         <w:pStyle w:val="Duudong"/>
         <w:spacing w:after="40"/>
+        <w:jc w:val="both"/>
         <w:rPr>
           <w:rFonts w:ascii="Times  New Roman" w:hAnsi="Times  New Roman"/>
           <w:sz w:val="28"/>
@@ -2353,6 +2456,7 @@
       <w:pPr>
         <w:pStyle w:val="Duudong"/>
         <w:spacing w:after="40"/>
+        <w:jc w:val="both"/>
         <w:rPr>
           <w:rFonts w:ascii="Times  New Roman" w:hAnsi="Times  New Roman"/>
           <w:sz w:val="28"/>
@@ -2399,6 +2503,7 @@
       <w:pPr>
         <w:pStyle w:val="Duudong"/>
         <w:spacing w:after="80"/>
+        <w:jc w:val="both"/>
         <w:rPr>
           <w:rFonts w:ascii="Times  New Roman" w:hAnsi="Times  New Roman"/>
           <w:sz w:val="28"/>
@@ -2422,7 +2527,17 @@
           <w:sz w:val="28"/>
           <w:szCs w:val="28"/>
         </w:rPr>
-        <w:t>Displays 20 study rooms across Buildings A, B, C, and V in an adaptive 60 FPS grid. Features real-time filtering chips by building, seat capacity (2–20), and equipment tags with smooth staggered entry animations (FadeInDown.springify()).</w:t>
+        <w:t xml:space="preserve">Displays 20 study rooms across Buildings A, B, C, and V in an adaptive 60 FPS grid. Features real-time filtering chips by building, seat capacity (2–20), and equipment tags with smooth staggered entry animations (FadeInDown.springify()). Dynamic column </w:t>
+      </w:r>
+      <w:r>
+        <w:rPr>
+          <w:rFonts w:ascii="Times  New Roman" w:hAnsi="Times  New Roman"/>
+          <w:color w:val="334155"/>
+          <w:sz w:val="28"/>
+          <w:szCs w:val="28"/>
+        </w:rPr>
+        <w:lastRenderedPageBreak/>
+        <w:t>calculation with 1140px max-width clamping ensures zero cut-off cards on desktop viewports.</w:t>
       </w:r>
     </w:p>
     <w:p>
@@ -2436,22 +2551,18 @@
         <w:spacing w:after="80"/>
         <w:ind w:left="360"/>
         <w:jc w:val="center"/>
-        <w:rPr>
-          <w:rFonts w:ascii="Times  New Roman" w:hAnsi="Times  New Roman"/>
+      </w:pPr>
+      <w:r>
+        <w:rPr>
+          <w:rFonts w:ascii="Times  New Roman" w:hAnsi="Times  New Roman"/>
+          <w:noProof/>
           <w:sz w:val="28"/>
           <w:szCs w:val="28"/>
         </w:rPr>
-      </w:pPr>
-      <w:r>
-        <w:rPr>
-          <w:rFonts w:ascii="Times  New Roman" w:hAnsi="Times  New Roman"/>
-          <w:sz w:val="28"/>
-          <w:szCs w:val="28"/>
-        </w:rPr>
         <w:drawing>
-          <wp:inline distT="0" distB="0" distL="0" distR="0" wp14:anchorId="7C9CCC2A" wp14:editId="19F470B7">
-            <wp:extent cx="3693511" cy="2880165"/>
-            <wp:effectExtent l="0" t="0" r="2540" b="0"/>
+          <wp:inline distT="0" distB="0" distL="0" distR="0" wp14:anchorId="3227E516" wp14:editId="39184926">
+            <wp:extent cx="4269874" cy="3329608"/>
+            <wp:effectExtent l="0" t="0" r="0" b="4445"/>
             <wp:docPr id="1695260033" name="Hình ảnh 1"/>
             <wp:cNvGraphicFramePr>
               <a:graphicFrameLocks xmlns:a="http://schemas.openxmlformats.org/drawingml/2006/main" noChangeAspect="1"/>
@@ -2472,7 +2583,7 @@
                   <pic:spPr>
                     <a:xfrm>
                       <a:off x="0" y="0"/>
-                      <a:ext cx="3707640" cy="2891183"/>
+                      <a:ext cx="4290233" cy="3345483"/>
                     </a:xfrm>
                     <a:prstGeom prst="rect">
                       <a:avLst/>
@@ -2564,6 +2675,7 @@
       <w:pPr>
         <w:pStyle w:val="Duudong"/>
         <w:spacing w:after="80"/>
+        <w:jc w:val="both"/>
         <w:rPr>
           <w:rFonts w:ascii="Times  New Roman" w:hAnsi="Times  New Roman"/>
           <w:sz w:val="28"/>
@@ -2578,7 +2690,6 @@
           <w:sz w:val="28"/>
           <w:szCs w:val="28"/>
         </w:rPr>
-        <w:lastRenderedPageBreak/>
         <w:t xml:space="preserve">Interactive Time-Slot Selector &amp; 90s Countdown Modal (RoomDetailScreen): </w:t>
       </w:r>
       <w:r>
@@ -2602,20 +2713,18 @@
         <w:spacing w:after="80"/>
         <w:ind w:left="360"/>
         <w:jc w:val="center"/>
-        <w:rPr>
-          <w:rFonts w:ascii="Times  New Roman" w:hAnsi="Times  New Roman"/>
-        </w:rPr>
       </w:pPr>
       <w:r>
         <w:rPr>
           <w:rFonts w:ascii="Times  New Roman" w:hAnsi="Times  New Roman"/>
+          <w:noProof/>
           <w:sz w:val="28"/>
           <w:szCs w:val="28"/>
         </w:rPr>
         <w:drawing>
-          <wp:inline distT="0" distB="0" distL="0" distR="0" wp14:anchorId="35FC98AB" wp14:editId="6E83F5A9">
-            <wp:extent cx="4512366" cy="3318424"/>
-            <wp:effectExtent l="0" t="0" r="2540" b="0"/>
+          <wp:inline distT="0" distB="0" distL="0" distR="0" wp14:anchorId="5A9C72BB" wp14:editId="7275C80F">
+            <wp:extent cx="4084237" cy="3003575"/>
+            <wp:effectExtent l="0" t="0" r="0" b="6350"/>
             <wp:docPr id="814610516" name="Hình ảnh 1"/>
             <wp:cNvGraphicFramePr>
               <a:graphicFrameLocks xmlns:a="http://schemas.openxmlformats.org/drawingml/2006/main" noChangeAspect="1"/>
@@ -2636,7 +2745,7 @@
                   <pic:spPr>
                     <a:xfrm>
                       <a:off x="0" y="0"/>
-                      <a:ext cx="4521335" cy="3325020"/>
+                      <a:ext cx="4096025" cy="3012244"/>
                     </a:xfrm>
                     <a:prstGeom prst="rect">
                       <a:avLst/>
@@ -2695,7 +2804,6 @@
       <w:r>
         <w:rPr>
           <w:rFonts w:ascii="Times  New Roman" w:hAnsi="Times  New Roman"/>
-          <w:noProof/>
           <w:sz w:val="20"/>
           <w:szCs w:val="20"/>
         </w:rPr>
@@ -2714,7 +2822,6 @@
           <w:rFonts w:ascii="Times  New Roman" w:hAnsi="Times  New Roman"/>
           <w:sz w:val="20"/>
           <w:szCs w:val="20"/>
-          <w:lang w:val="vi-VN"/>
         </w:rPr>
         <w:t xml:space="preserve">. </w:t>
       </w:r>
@@ -2731,6 +2838,7 @@
       <w:pPr>
         <w:pStyle w:val="Duudong"/>
         <w:spacing w:after="80"/>
+        <w:jc w:val="both"/>
         <w:rPr>
           <w:rFonts w:ascii="Times  New Roman" w:hAnsi="Times  New Roman"/>
           <w:sz w:val="28"/>
@@ -2745,6 +2853,7 @@
           <w:sz w:val="28"/>
           <w:szCs w:val="28"/>
         </w:rPr>
+        <w:lastRenderedPageBreak/>
         <w:t xml:space="preserve">Personal Reservations &amp; Offline Synchronization (MyBookingsScreen): </w:t>
       </w:r>
       <w:r>
@@ -2768,18 +2877,16 @@
         <w:spacing w:after="80"/>
         <w:ind w:left="360"/>
         <w:jc w:val="center"/>
-        <w:rPr>
-          <w:rFonts w:ascii="Times  New Roman" w:hAnsi="Times  New Roman"/>
-        </w:rPr>
       </w:pPr>
       <w:r>
         <w:rPr>
           <w:rFonts w:ascii="Times  New Roman" w:hAnsi="Times  New Roman"/>
+          <w:noProof/>
           <w:sz w:val="28"/>
           <w:szCs w:val="28"/>
         </w:rPr>
         <w:drawing>
-          <wp:inline distT="0" distB="0" distL="0" distR="0" wp14:anchorId="0FB4403E" wp14:editId="1DF46D2C">
+          <wp:inline distT="0" distB="0" distL="0" distR="0" wp14:anchorId="07CEB1B2" wp14:editId="1F83A3C7">
             <wp:extent cx="4630255" cy="2604052"/>
             <wp:effectExtent l="0" t="0" r="0" b="6350"/>
             <wp:docPr id="1825360206" name="Hình ảnh 1"/>
@@ -2894,6 +3001,7 @@
       <w:pPr>
         <w:pStyle w:val="Duudong"/>
         <w:spacing w:after="80"/>
+        <w:jc w:val="both"/>
         <w:rPr>
           <w:rFonts w:ascii="Times  New Roman" w:hAnsi="Times  New Roman"/>
           <w:sz w:val="28"/>
@@ -2908,7 +3016,6 @@
           <w:sz w:val="28"/>
           <w:szCs w:val="28"/>
         </w:rPr>
-        <w:lastRenderedPageBreak/>
         <w:t xml:space="preserve">Digital QR Booking Pass (Check-in Modal): </w:t>
       </w:r>
       <w:r>
@@ -2932,18 +3039,16 @@
         <w:spacing w:after="80"/>
         <w:ind w:left="360"/>
         <w:jc w:val="center"/>
-        <w:rPr>
-          <w:rFonts w:ascii="Times  New Roman" w:hAnsi="Times  New Roman"/>
-        </w:rPr>
       </w:pPr>
       <w:r>
         <w:rPr>
           <w:rFonts w:ascii="Times  New Roman" w:hAnsi="Times  New Roman"/>
+          <w:noProof/>
           <w:sz w:val="28"/>
           <w:szCs w:val="28"/>
         </w:rPr>
         <w:drawing>
-          <wp:inline distT="0" distB="0" distL="0" distR="0" wp14:anchorId="684DED1D" wp14:editId="5C1B0A3C">
+          <wp:inline distT="0" distB="0" distL="0" distR="0" wp14:anchorId="15D6194B" wp14:editId="51951EF9">
             <wp:extent cx="4530256" cy="3239480"/>
             <wp:effectExtent l="0" t="0" r="3810" b="0"/>
             <wp:docPr id="1560806209" name="Hình ảnh 1"/>
@@ -3056,6 +3161,171 @@
     </w:p>
     <w:p>
       <w:pPr>
+        <w:pStyle w:val="Duudong"/>
+        <w:spacing w:after="80"/>
+        <w:jc w:val="both"/>
+        <w:rPr>
+          <w:rFonts w:ascii="Times  New Roman" w:hAnsi="Times  New Roman"/>
+          <w:sz w:val="28"/>
+          <w:szCs w:val="28"/>
+        </w:rPr>
+      </w:pPr>
+      <w:r>
+        <w:rPr>
+          <w:rFonts w:ascii="Times  New Roman" w:hAnsi="Times  New Roman"/>
+          <w:b/>
+          <w:color w:val="1E3A5F"/>
+          <w:sz w:val="28"/>
+          <w:szCs w:val="28"/>
+        </w:rPr>
+        <w:lastRenderedPageBreak/>
+        <w:t xml:space="preserve">Modern Minimalist Authentication (LoginScreen &amp; RegisterScreen): </w:t>
+      </w:r>
+      <w:r>
+        <w:rPr>
+          <w:rFonts w:ascii="Times  New Roman" w:hAnsi="Times  New Roman"/>
+          <w:color w:val="334155"/>
+          <w:sz w:val="28"/>
+          <w:szCs w:val="28"/>
+        </w:rPr>
+        <w:t>Streamlined, distraction-free authentication interface enforcing valid email credentials. Seamless handling of email confirmation tokens via Supabase Auth deep links with automated URL hash sanitization.</w:t>
+      </w:r>
+    </w:p>
+    <w:p>
+      <w:pPr>
+        <w:pStyle w:val="Duudong"/>
+        <w:keepNext/>
+        <w:numPr>
+          <w:ilvl w:val="0"/>
+          <w:numId w:val="0"/>
+        </w:numPr>
+        <w:tabs>
+          <w:tab w:val="left" w:pos="3052"/>
+        </w:tabs>
+        <w:spacing w:after="80"/>
+        <w:ind w:left="360"/>
+        <w:jc w:val="center"/>
+      </w:pPr>
+      <w:r>
+        <w:rPr>
+          <w:rFonts w:ascii="Times  New Roman" w:hAnsi="Times  New Roman"/>
+          <w:sz w:val="28"/>
+          <w:szCs w:val="28"/>
+        </w:rPr>
+        <w:drawing>
+          <wp:inline distT="0" distB="0" distL="0" distR="0" wp14:anchorId="16BE2B8C" wp14:editId="5D4BD17F">
+            <wp:extent cx="2629870" cy="3004800"/>
+            <wp:effectExtent l="0" t="0" r="0" b="5715"/>
+            <wp:docPr id="789317474" name="Hình ảnh 1"/>
+            <wp:cNvGraphicFramePr>
+              <a:graphicFrameLocks xmlns:a="http://schemas.openxmlformats.org/drawingml/2006/main" noChangeAspect="1"/>
+            </wp:cNvGraphicFramePr>
+            <a:graphic xmlns:a="http://schemas.openxmlformats.org/drawingml/2006/main">
+              <a:graphicData uri="http://schemas.openxmlformats.org/drawingml/2006/picture">
+                <pic:pic xmlns:pic="http://schemas.openxmlformats.org/drawingml/2006/picture">
+                  <pic:nvPicPr>
+                    <pic:cNvPr id="789317474" name=""/>
+                    <pic:cNvPicPr/>
+                  </pic:nvPicPr>
+                  <pic:blipFill>
+                    <a:blip r:embed="rId10"/>
+                    <a:stretch>
+                      <a:fillRect/>
+                    </a:stretch>
+                  </pic:blipFill>
+                  <pic:spPr>
+                    <a:xfrm>
+                      <a:off x="0" y="0"/>
+                      <a:ext cx="2638117" cy="3014223"/>
+                    </a:xfrm>
+                    <a:prstGeom prst="rect">
+                      <a:avLst/>
+                    </a:prstGeom>
+                  </pic:spPr>
+                </pic:pic>
+              </a:graphicData>
+            </a:graphic>
+          </wp:inline>
+        </w:drawing>
+      </w:r>
+    </w:p>
+    <w:p>
+      <w:pPr>
+        <w:pStyle w:val="Chuthich"/>
+        <w:jc w:val="center"/>
+        <w:rPr>
+          <w:rFonts w:ascii="Times  New Roman" w:hAnsi="Times  New Roman"/>
+          <w:sz w:val="20"/>
+          <w:szCs w:val="20"/>
+        </w:rPr>
+      </w:pPr>
+      <w:r>
+        <w:rPr>
+          <w:rFonts w:ascii="Times  New Roman" w:hAnsi="Times  New Roman"/>
+          <w:sz w:val="20"/>
+          <w:szCs w:val="20"/>
+        </w:rPr>
+        <w:t xml:space="preserve">Figure </w:t>
+      </w:r>
+      <w:r>
+        <w:rPr>
+          <w:rFonts w:ascii="Times  New Roman" w:hAnsi="Times  New Roman"/>
+          <w:sz w:val="20"/>
+          <w:szCs w:val="20"/>
+        </w:rPr>
+        <w:fldChar w:fldCharType="begin"/>
+      </w:r>
+      <w:r>
+        <w:rPr>
+          <w:rFonts w:ascii="Times  New Roman" w:hAnsi="Times  New Roman"/>
+          <w:sz w:val="20"/>
+          <w:szCs w:val="20"/>
+        </w:rPr>
+        <w:instrText xml:space="preserve"> SEQ Figure \* ARABIC </w:instrText>
+      </w:r>
+      <w:r>
+        <w:rPr>
+          <w:rFonts w:ascii="Times  New Roman" w:hAnsi="Times  New Roman"/>
+          <w:sz w:val="20"/>
+          <w:szCs w:val="20"/>
+        </w:rPr>
+        <w:fldChar w:fldCharType="separate"/>
+      </w:r>
+      <w:r>
+        <w:rPr>
+          <w:rFonts w:ascii="Times  New Roman" w:hAnsi="Times  New Roman"/>
+          <w:sz w:val="20"/>
+          <w:szCs w:val="20"/>
+        </w:rPr>
+        <w:t>5</w:t>
+      </w:r>
+      <w:r>
+        <w:rPr>
+          <w:rFonts w:ascii="Times  New Roman" w:hAnsi="Times  New Roman"/>
+          <w:sz w:val="20"/>
+          <w:szCs w:val="20"/>
+        </w:rPr>
+        <w:fldChar w:fldCharType="end"/>
+      </w:r>
+      <w:r>
+        <w:rPr>
+          <w:rFonts w:ascii="Times  New Roman" w:hAnsi="Times  New Roman"/>
+          <w:sz w:val="20"/>
+          <w:szCs w:val="20"/>
+        </w:rPr>
+        <w:t xml:space="preserve">. </w:t>
+      </w:r>
+      <w:r>
+        <w:rPr>
+          <w:rFonts w:ascii="Times  New Roman" w:hAnsi="Times  New Roman"/>
+          <w:sz w:val="20"/>
+          <w:szCs w:val="20"/>
+        </w:rPr>
+        <w:t>Modern Minimalist Authentication (LoginScreen &amp; RegisterScreen)</w:t>
+      </w:r>
+    </w:p>
+    <w:p>
+      <w:pPr>
         <w:pStyle w:val="u1"/>
         <w:spacing w:before="320" w:after="120"/>
         <w:rPr>
@@ -3087,12 +3357,13 @@
           <w:sz w:val="28"/>
           <w:szCs w:val="28"/>
         </w:rPr>
-        <w:t>Challenge 1: Distributed Race Conditions &amp; The 90-Second Soft Hold</w:t>
+        <w:t>5.1 Challenge 1 (State Management &amp; Caching): Strict Decoupling of Client State (Zustand) &amp; Server State (TanStack Query)</w:t>
       </w:r>
     </w:p>
     <w:p>
       <w:pPr>
         <w:spacing w:after="120"/>
+        <w:jc w:val="both"/>
         <w:rPr>
           <w:rFonts w:ascii="Times  New Roman" w:hAnsi="Times  New Roman"/>
           <w:sz w:val="28"/>
@@ -3106,7 +3377,7 @@
           <w:sz w:val="28"/>
           <w:szCs w:val="28"/>
         </w:rPr>
-        <w:t>Problem: In high-traffic scenarios (e.g., final exam week), multiple students may attempt to reserve the same room slot simultaneously. Naive client-side checks allow double-booking (Time-of-Check to Time-of-Use vulnerability). Furthermore, if a user dismissed the hold modal during network flight, unreleased holds caused phantom 90-second locks.</w:t>
+        <w:t>Problem: In accordance with the VKU Week 6 curriculum guideline ('Zustand for client state + TanStack Query for server state — don't mix them'), a major architecture challenge was maintaining a clean separation of concerns. Storing rooms and remote availability entirely in Zustand led to stale data, memory overhead, and lacked automated background revalidation and pull-to-refresh. Conversely, managing volatile checkout holds (90s countdown), search filters, and persistent offline outbox mutations in TanStack Query degraded UI immediacy and prevented robust @react-native-async-storage/async-storage persistence under key 'vku-booking-storage'.</w:t>
       </w:r>
       <w:r>
         <w:rPr>
@@ -3116,7 +3387,17 @@
           <w:szCs w:val="28"/>
         </w:rPr>
         <w:br/>
-        <w:t>Resolution: (1) Implemented a dual-barrier locking mechanism: PostgreSQL transaction-level advisory locks (pg_advisory_xact_lock) combined with a partial unique constraint idx_bookings_active_slot (room_id, booking_date, slot_index) WHERE status = 'CONFIRMED'. (2) Implemented isCancelledRef inside ConfirmBookingModal: If the user cancels the modal before the server responds to initiateHold, the in-flight result is immediately rolled back via a background releaseHold call, ensuring slots return to AVAILABLE without delay.</w:t>
+        <w:t xml:space="preserve">Resolution: (1) Server State (TanStack Query 5): Encapsulated the remote room catalog inside a custom useRooms(building) hook, configured with staleTime: 5min and gcTime: 10min. Wired data, isLoading, and refetch directly into FlatList's native refreshing and onRefresh props for pull-to-refresh capabilities. (2) Client State (Zustand 5 + persist): Confined user reservations (myBookings), offline outbox, active 90s hold sessions, and UI filter chips to useBookingStore. Enforced AsyncStorage persistence </w:t>
+      </w:r>
+      <w:r>
+        <w:rPr>
+          <w:rFonts w:ascii="Times  New Roman" w:hAnsi="Times  New Roman"/>
+          <w:color w:val="334155"/>
+          <w:sz w:val="28"/>
+          <w:szCs w:val="28"/>
+        </w:rPr>
+        <w:lastRenderedPageBreak/>
+        <w:t>under key 'vku-booking-storage' with narrow, atomic selector subscriptions (useBookingStore(s =&gt; s.myBookings)), eliminating unnecessary full-screen re-renders.</w:t>
       </w:r>
     </w:p>
     <w:p>
@@ -3136,12 +3417,13 @@
           <w:sz w:val="28"/>
           <w:szCs w:val="28"/>
         </w:rPr>
-        <w:t>Challenge 2: Offline Outbox Causality &amp; Conflict Reconciliation</w:t>
+        <w:t>5.2 Challenge 2 (Core Features &amp; Concurrency): Eliminating Race Conditions (TOCTOU) &amp; Managing 90-Second Soft Holds</w:t>
       </w:r>
     </w:p>
     <w:p>
       <w:pPr>
         <w:spacing w:after="120"/>
+        <w:jc w:val="both"/>
         <w:rPr>
           <w:rFonts w:ascii="Times  New Roman" w:hAnsi="Times  New Roman"/>
           <w:sz w:val="28"/>
@@ -3155,7 +3437,7 @@
           <w:sz w:val="28"/>
           <w:szCs w:val="28"/>
         </w:rPr>
-        <w:t xml:space="preserve">Problem: When a student books while walking through dead zones (offline), naive approaches either block the user or optimistically mark the booking as confirmed, </w:t>
+        <w:t>Problem: In high-concurrency academic settings (e.g. final exam revision week), multiple students attempt to book the exact same study room and time slot simultaneously. Naive client-side availability checks (SELECT ... WHERE status = 'CONFIRMED') suffer from Time-of-Check to Time-of-Use (TOCTOU) race conditions, resulting in catastrophic double-bookings. Furthermore, if a student opens a hold modal and cancels or disconnects mid-flight, unreleased holds create lingering 'phantom locks'.</w:t>
       </w:r>
       <w:r>
         <w:rPr>
@@ -3164,9 +3446,40 @@
           <w:sz w:val="28"/>
           <w:szCs w:val="28"/>
         </w:rPr>
-        <w:lastRenderedPageBreak/>
-        <w:t>causing severe confusion if another student booked the slot online.</w:t>
+        <w:br/>
+        <w:t>Resolution: (1) Realtime 90-Second Soft Hold: Instantiates an ephemeral reservation hold with a synchronized countdown timer upon slot selection, broadcasting HELD_BY_OTHER amber badges to all connected peers via Supabase Realtime channels. An isCancelledRef guard ensures that if a user cancels the modal before the server responds, an immediate background releaseHold is dispatched to return the slot to AVAILABLE. (2) PostgreSQL Advisory Locking &amp; Partial Unique Index: At the persistence layer, the stored procedure book_slot() enforces exclusive transaction-level advisory locks via PERFORM pg_advisory_xact_lock(hashtext(p_room_id || ':' || p_booking_date || ':' || p_slot_index)), backed by a partial unique index idx_bookings_active_slot (room_id, booking_date, slot_index) WHERE status = 'CONFIRMED'. Any concurrent attempt hitting the exact same microsecond fails with PostgreSQL error 23505 (SLOT_ALREADY_BOOKED). (3) Client-side Idempotency Keys (UUID v4): Protects against duplicate bookings caused by mobile packet loss and automatic HTTP retry flings.</w:t>
       </w:r>
+    </w:p>
+    <w:p>
+      <w:pPr>
+        <w:spacing w:before="80" w:after="40"/>
+        <w:rPr>
+          <w:rFonts w:ascii="Times  New Roman" w:hAnsi="Times  New Roman"/>
+          <w:sz w:val="28"/>
+          <w:szCs w:val="28"/>
+        </w:rPr>
+      </w:pPr>
+      <w:r>
+        <w:rPr>
+          <w:rFonts w:ascii="Times  New Roman" w:hAnsi="Times  New Roman"/>
+          <w:b/>
+          <w:color w:val="0284C7"/>
+          <w:sz w:val="28"/>
+          <w:szCs w:val="28"/>
+        </w:rPr>
+        <w:t>5.3 Challenge 3 (UI/UX &amp; Performance): 60 FPS FlatList Virtualization, Reanimated Layout Animations &amp; Desktop Grid Clamping</w:t>
+      </w:r>
+    </w:p>
+    <w:p>
+      <w:pPr>
+        <w:spacing w:after="120"/>
+        <w:jc w:val="both"/>
+        <w:rPr>
+          <w:rFonts w:ascii="Times  New Roman" w:hAnsi="Times  New Roman"/>
+          <w:sz w:val="28"/>
+          <w:szCs w:val="28"/>
+        </w:rPr>
+      </w:pPr>
       <w:r>
         <w:rPr>
           <w:rFonts w:ascii="Times  New Roman" w:hAnsi="Times  New Roman"/>
@@ -3174,8 +3487,138 @@
           <w:sz w:val="28"/>
           <w:szCs w:val="28"/>
         </w:rPr>
+        <w:t>Problem: Rendering a catalog of 20+ study rooms containing remote photographic thumbnails, status tags, and equipment badges causes frame drops and layout stutter on mobile devices during momentum flinging. Additionally, when running across cross-platform viewports (Web desktop 1920px+ vs Mobile), naive card width calculation using raw window.width pushed the second column of cards offscreen beyond the centered maxWidth: 1140px container.</w:t>
+      </w:r>
+      <w:r>
+        <w:rPr>
+          <w:rFonts w:ascii="Times  New Roman" w:hAnsi="Times  New Roman"/>
+          <w:color w:val="334155"/>
+          <w:sz w:val="28"/>
+          <w:szCs w:val="28"/>
+        </w:rPr>
         <w:br/>
-        <w:t>Resolution: Built an explicit Offline Outbox Engine: Offline bookings are created with state PENDING_SYNC and queued in FIFO order. When NetInfo detects reconnection, the engine sequentially flushes outbox items against the server. If the slot was taken while offline, the booking is transitioned deterministically to CONFLICTED with human-readable error diagnostics, avoiding silent data corruption.</w:t>
+        <w:t xml:space="preserve">Resolution: (1) FlatList Virtualization &amp; Sync Layout: Fixed item dimensions to ROOM_CARD_HEIGHT = 136px and provided getItemLayout for synchronous </w:t>
+      </w:r>
+      <w:r>
+        <w:rPr>
+          <w:rFonts w:ascii="Times  New Roman" w:hAnsi="Times  New Roman"/>
+          <w:color w:val="334155"/>
+          <w:sz w:val="28"/>
+          <w:szCs w:val="28"/>
+        </w:rPr>
+        <w:lastRenderedPageBreak/>
+        <w:t>coordinate calculation without bridge measurement. Configured initialNumToRender: 8, maxToRenderPerBatch: 8, windowSize: 5, and removeClippedSubviews: true. (2) Worklet-Driven Layout Animations (Reanimated 3): Integrated FadeInDown.delay(index * 60).springify() executing directly on the UI thread via Hermes worklets, completely bypassing the asynchronous JavaScript bridge for buttery 60/120 FPS transitions. (3) Adaptive Width Clamping: Re-architected useResponsiveLayout to clamp calculation to effectiveWidth = Math.min(width, 1140). In RoomListScreen, each card container is styled with flex: 1 and maxWidth: cardWidth, guaranteeing symmetric 2-column distribution and 0% card cut-off across all display form factors.</w:t>
+      </w:r>
+    </w:p>
+    <w:p>
+      <w:pPr>
+        <w:spacing w:before="80" w:after="40"/>
+        <w:rPr>
+          <w:rFonts w:ascii="Times  New Roman" w:hAnsi="Times  New Roman"/>
+          <w:sz w:val="28"/>
+          <w:szCs w:val="28"/>
+        </w:rPr>
+      </w:pPr>
+      <w:r>
+        <w:rPr>
+          <w:rFonts w:ascii="Times  New Roman" w:hAnsi="Times  New Roman"/>
+          <w:b/>
+          <w:color w:val="0284C7"/>
+          <w:sz w:val="28"/>
+          <w:szCs w:val="28"/>
+        </w:rPr>
+        <w:t>5.4 Challenge 4 (Navigation Architecture &amp; Type Safety): Nested Type-Safe Routing (React Navigation 7) &amp; Deep Linking URL Sanitization</w:t>
+      </w:r>
+    </w:p>
+    <w:p>
+      <w:pPr>
+        <w:spacing w:after="120"/>
+        <w:jc w:val="both"/>
+        <w:rPr>
+          <w:rFonts w:ascii="Times  New Roman" w:hAnsi="Times  New Roman"/>
+          <w:sz w:val="28"/>
+          <w:szCs w:val="28"/>
+        </w:rPr>
+      </w:pPr>
+      <w:r>
+        <w:rPr>
+          <w:rFonts w:ascii="Times  New Roman" w:hAnsi="Times  New Roman"/>
+          <w:color w:val="334155"/>
+          <w:sz w:val="28"/>
+          <w:szCs w:val="28"/>
+        </w:rPr>
+        <w:t>Problem: Mini-Project 2 requires a complex nested navigation hierarchy combining Root Native Stack, Bottom Tabs (BrowseRooms, MyBookings, Profile), and Modal presentations (ConfirmBookingModal, BookingPassModal). In loosely-typed setups, route typos and missing route parameters produce silent runtime crashes on mobile devices. Additionally, email verification deep links deposit access tokens into the web address bar (#access_token=...), triggering unintended authentication reload loops on refresh.</w:t>
+      </w:r>
+      <w:r>
+        <w:rPr>
+          <w:rFonts w:ascii="Times  New Roman" w:hAnsi="Times  New Roman"/>
+          <w:color w:val="334155"/>
+          <w:sz w:val="28"/>
+          <w:szCs w:val="28"/>
+        </w:rPr>
+        <w:br/>
+        <w:t>Resolution: (1) Comprehensive TypeScript Route Contracts: Defined strict RootStackParamList and MainTabParamList types, typed every screen with NativeStackScreenProps, and provided typed navigation hooks (useNavigation&lt;NavigationProp&gt;()), guaranteeing 100% compile-time route verification (npx tsc --noEmit). (2) Nesting Architecture: Root Stack wraps Main Tabs, allowing Room Details and Modals to push on top and cleanly hide the tab bar when focused interaction is required. (3) URL Hash Sanitization: Integrated window.history.replaceState into useAuthStore to automatically strip hash fragments (#access_token=...) immediately upon session ingestion and logout, preventing reload loops.</w:t>
+      </w:r>
+    </w:p>
+    <w:p>
+      <w:pPr>
+        <w:spacing w:before="80" w:after="40"/>
+        <w:rPr>
+          <w:rFonts w:ascii="Times  New Roman" w:hAnsi="Times  New Roman"/>
+          <w:sz w:val="28"/>
+          <w:szCs w:val="28"/>
+        </w:rPr>
+      </w:pPr>
+      <w:r>
+        <w:rPr>
+          <w:rFonts w:ascii="Times  New Roman" w:hAnsi="Times  New Roman"/>
+          <w:b/>
+          <w:color w:val="0284C7"/>
+          <w:sz w:val="28"/>
+          <w:szCs w:val="28"/>
+        </w:rPr>
+        <w:t>5.5 Challenge 5 (Offline Outbox &amp; Network Resilience): Sequential Outbox Flusher &amp; Deterministic Conflict Reconciliation</w:t>
+      </w:r>
+    </w:p>
+    <w:p>
+      <w:pPr>
+        <w:spacing w:after="120"/>
+        <w:jc w:val="both"/>
+        <w:rPr>
+          <w:rFonts w:ascii="Times  New Roman" w:hAnsi="Times  New Roman"/>
+          <w:color w:val="334155"/>
+          <w:sz w:val="28"/>
+          <w:szCs w:val="28"/>
+        </w:rPr>
+      </w:pPr>
+      <w:r>
+        <w:rPr>
+          <w:rFonts w:ascii="Times  New Roman" w:hAnsi="Times  New Roman"/>
+          <w:color w:val="334155"/>
+          <w:sz w:val="28"/>
+          <w:szCs w:val="28"/>
+        </w:rPr>
+        <w:t xml:space="preserve">Problem: University campus environments present frequent connectivity dead zones (elevators, basements, crowded lecture halls). Naive mobile implementations either freeze the UI with blocking spinners or mistakenly mark offline bookings as CONFIRMED locally, causing severe disputes when a student arrives at a room that </w:t>
+      </w:r>
+      <w:r>
+        <w:rPr>
+          <w:rFonts w:ascii="Times  New Roman" w:hAnsi="Times  New Roman"/>
+          <w:color w:val="334155"/>
+          <w:sz w:val="28"/>
+          <w:szCs w:val="28"/>
+        </w:rPr>
+        <w:lastRenderedPageBreak/>
+        <w:t>was legitimately booked by someone else online.</w:t>
+      </w:r>
+      <w:r>
+        <w:rPr>
+          <w:rFonts w:ascii="Times  New Roman" w:hAnsi="Times  New Roman"/>
+          <w:color w:val="334155"/>
+          <w:sz w:val="28"/>
+          <w:szCs w:val="28"/>
+        </w:rPr>
+        <w:br/>
+        <w:t>Resolution: (1) Zero False Confirmation Contract: Bookings initiated while offline are strictly stored in myBookings and outbox with status PENDING_SYNC. The UI displays an amber badge and disables the QR Check-in Pass until server verification is achieved. (2) Sequential Flusher (FIFO): syncService processes pending outbox requests one-by-one via for...of loops with transactional delays (80ms), strictly avoiding Promise.all() to preserve causality and protect student daily quota constraints (max 2 slots/day). (3) Deterministic Conflict Handling: If a slot was taken online while the device was disconnected, the server rejects the synchronization with SLOT_ALREADY_BOOKED. The flusher marks both the outbox item and local booking as CONFLICTED, captures the error message, and dispatches a local high-priority notification via expo-notifications alerting the student to select an alternate slot.</w:t>
       </w:r>
     </w:p>
     <w:sectPr>
@@ -3343,7 +3786,7 @@
   <w:abstractNum w:abstractNumId="8" w15:restartNumberingAfterBreak="0">
     <w:nsid w:val="FFFFFF89"/>
     <w:multiLevelType w:val="singleLevel"/>
-    <w:tmpl w:val="29761A62"/>
+    <w:tmpl w:val="CA48C5AE"/>
     <w:lvl w:ilvl="0">
       <w:start w:val="1"/>
       <w:numFmt w:val="bullet"/>
@@ -3361,31 +3804,31 @@
       </w:rPr>
     </w:lvl>
   </w:abstractNum>
-  <w:num w:numId="1" w16cid:durableId="1413161960">
+  <w:num w:numId="1" w16cid:durableId="1450466685">
     <w:abstractNumId w:val="8"/>
   </w:num>
-  <w:num w:numId="2" w16cid:durableId="2102606946">
+  <w:num w:numId="2" w16cid:durableId="1486777919">
     <w:abstractNumId w:val="6"/>
   </w:num>
-  <w:num w:numId="3" w16cid:durableId="419453498">
+  <w:num w:numId="3" w16cid:durableId="1684016413">
     <w:abstractNumId w:val="5"/>
   </w:num>
-  <w:num w:numId="4" w16cid:durableId="1798066316">
+  <w:num w:numId="4" w16cid:durableId="322776597">
     <w:abstractNumId w:val="4"/>
   </w:num>
-  <w:num w:numId="5" w16cid:durableId="1019504511">
+  <w:num w:numId="5" w16cid:durableId="791704987">
     <w:abstractNumId w:val="7"/>
   </w:num>
-  <w:num w:numId="6" w16cid:durableId="1378316748">
+  <w:num w:numId="6" w16cid:durableId="2072458555">
     <w:abstractNumId w:val="3"/>
   </w:num>
-  <w:num w:numId="7" w16cid:durableId="260768377">
+  <w:num w:numId="7" w16cid:durableId="1509557348">
     <w:abstractNumId w:val="2"/>
   </w:num>
-  <w:num w:numId="8" w16cid:durableId="1577206296">
+  <w:num w:numId="8" w16cid:durableId="1769307030">
     <w:abstractNumId w:val="1"/>
   </w:num>
-  <w:num w:numId="9" w16cid:durableId="1106727588">
+  <w:num w:numId="9" w16cid:durableId="1824077544">
     <w:abstractNumId w:val="0"/>
   </w:num>
 </w:numbering>

</xml_diff>